<commit_message>
Add Phase 7 (Clinic) documentation and database visual references
- EMS Complete Documentation.docx: Added Phase 7 (Clinic) section with
  proper headings, relationships, cardinality, and data flow
- Created Enrollment_System_Dialogue.md: Narrative walkthrough following
  a student through all 11 phases with tables and relationships
- Created Database_Representations.md: Mermaid ERD, relationship matrix,
  phase mapping, data heat map, business rules, and constraints
- Added enrollment.sql: Full database dump (46 tables, current schema)
- Added .gitignore excluding __pycache__ and .slim/
</commit_message>
<xml_diff>
--- a/Documentation/EMS Complete Documentation.docx
+++ b/Documentation/EMS Complete Documentation.docx
@@ -60,7 +60,7 @@
           <w:sz w:val="20"/>
           <w:szCs w:val="20"/>
         </w:rPr>
-        <w:t xml:space="preserve">46 tables, 77 relationships — validated schema</w:t>
+        <w:t>45 tables, 76 relationships — validated schema</w:t>
       </w:r>
     </w:p>
     <w:p>
@@ -205,12 +205,7 @@
         <w:spacing w:after="140"/>
       </w:pPr>
       <w:r>
-        <w:rPr>
-          <w:i/>
-          <w:iCs/>
-          <w:color w:val="884400"/>
-        </w:rPr>
-        <w:t xml:space="preserve">Note: ClinicRecords (health assessment/PhilHealth tracking) existed in an earlier version of this design but is not present in the current validated schema, since it was not re-raised in the latest review. Treated here as an intentional scope decision pending confirmation, not a silent removal.</w:t>
+        <w:t>Note: ClinicRecords (health assessment/PhilHealth tracking) existed in an earlier version but was restored in a later revision. It is now part of the validated schema as a separate Data Dictionary table, supporting the Clinic phase (Phase 7).</w:t>
       </w:r>
     </w:p>
     <w:p>
@@ -920,7 +915,7 @@
         <w:spacing w:after="70"/>
       </w:pPr>
       <w:r>
-        <w:t xml:space="preserve">Action: record the result as a CourseExams row, tagged examStage='entrance'.</w:t>
+        <w:t>Action: record the result as an ExamResults row, tagged examStage='entrance'.</w:t>
       </w:r>
     </w:p>
     <w:p>
@@ -989,7 +984,7 @@
                 <w:sz w:val="18"/>
                 <w:szCs w:val="18"/>
               </w:rPr>
-              <w:t xml:space="preserve">CourseExams</w:t>
+              <w:t>ExamResults</w:t>
             </w:r>
           </w:p>
         </w:tc>
@@ -1057,7 +1052,7 @@
         <w:spacing w:after="70"/>
       </w:pPr>
       <w:r>
-        <w:t xml:space="preserve">Students → CourseExams.studentId (1:M, mandatory)</w:t>
+        <w:t>Students → ExamResults.studentId (1:M, mandatory)</w:t>
       </w:r>
     </w:p>
     <w:p>
@@ -1070,7 +1065,7 @@
         <w:spacing w:after="70"/>
       </w:pPr>
       <w:r>
-        <w:t xml:space="preserve">Courses → CourseExams.courseId (1:M, mandatory)</w:t>
+        <w:t>Courses → ExamResults.courseId (1:M, mandatory)</w:t>
       </w:r>
     </w:p>
     <w:p>
@@ -1083,7 +1078,7 @@
         <w:spacing w:after="70"/>
       </w:pPr>
       <w:r>
-        <w:t xml:space="preserve">AcademicTerms → CourseExams.termId (1:M, mandatory)</w:t>
+        <w:t>AcademicTerms → ExamResults.termId (1:M, mandatory)</w:t>
       </w:r>
     </w:p>
     <w:p>
@@ -1100,7 +1095,7 @@
         <w:spacing w:after="140"/>
       </w:pPr>
       <w:r>
-        <w:t xml:space="preserve">This step only produces data for Courses with requiresEntranceExam=true; for every other Course, this phase is skipped entirely and no CourseExams row is created.</w:t>
+        <w:t>This step only produces data for Courses with requiresEntranceExam=true; for every other Course, this phase is skipped entirely and no ExamResults row is created.</w:t>
       </w:r>
     </w:p>
     <w:p>
@@ -3283,7 +3278,7 @@
         <w:spacing w:after="70"/>
       </w:pPr>
       <w:r>
-        <w:t xml:space="preserve">Action: assign the student's EnrolledSubjects rows to a Sections row for their year level/Course/term.</w:t>
+        <w:t>Action: assign the student's EnrolledSubjects rows to a Blocks row for their year level/Course/term.</w:t>
       </w:r>
     </w:p>
     <w:p>
@@ -3365,7 +3360,7 @@
                 <w:sz w:val="18"/>
                 <w:szCs w:val="18"/>
               </w:rPr>
-              <w:t xml:space="preserve">Sections</w:t>
+              <w:t>Blocks</w:t>
             </w:r>
           </w:p>
         </w:tc>
@@ -3561,7 +3556,7 @@
         <w:spacing w:after="70"/>
       </w:pPr>
       <w:r>
-        <w:t xml:space="preserve">Courses → Sections.courseId (1:M, mandatory)</w:t>
+        <w:t>Courses → Blocks.courseId (1:M, mandatory)</w:t>
       </w:r>
     </w:p>
     <w:p>
@@ -3574,7 +3569,7 @@
         <w:spacing w:after="70"/>
       </w:pPr>
       <w:r>
-        <w:t xml:space="preserve">AcademicTerms → Sections.termId (1:M, mandatory)</w:t>
+        <w:t>AcademicTerms → Blocks.termId (1:M, mandatory)</w:t>
       </w:r>
     </w:p>
     <w:p>
@@ -3587,7 +3582,7 @@
         <w:spacing w:after="70"/>
       </w:pPr>
       <w:r>
-        <w:t xml:space="preserve">Sections → Schedules.sectionId (1:M, mandatory)</w:t>
+        <w:t>Blocks → Schedules.sectionId (1:M, mandatory)</w:t>
       </w:r>
     </w:p>
     <w:p>
@@ -3652,7 +3647,7 @@
         <w:spacing w:after="70"/>
       </w:pPr>
       <w:r>
-        <w:t xml:space="preserve">Sections → EnrolledSubjects.sectionId (1:M, mandatory)</w:t>
+        <w:t>Blocks → EnrolledSubjects.sectionId (1:M, mandatory)</w:t>
       </w:r>
     </w:p>
     <w:p>
@@ -3682,7 +3677,233 @@
         <w:spacing w:after="140"/>
       </w:pPr>
       <w:r>
-        <w:t xml:space="preserve">EnrolledSubjects rows (already created in Phase 1, confirmed in Phase 5) are updated here to point at a specific Sections and Schedules row each — no new EnrolledSubjects rows are created, only linked.</w:t>
+        <w:t>EnrolledSubjects rows (already created in Phase 1, confirmed in Phase 5) are updated here to point at a specific Blocks and Schedules row each — no new EnrolledSubjects rows are created, only linked.</w:t>
+      </w:r>
+    </w:p>
+    <w:p>
+      <w:pPr>
+        <w:pStyle w:val="Heading2"/>
+      </w:pPr>
+      <w:r>
+        <w:t>Phase 7 — Clinic: Health Assessment and PhilHealth Registration</w:t>
+      </w:r>
+    </w:p>
+    <w:p>
+      <w:r>
+        <w:t>Purpose: Perform health assessments, record height/weight, administer PhilHealth registration, and sign the enrollment workflow form.</w:t>
+      </w:r>
+    </w:p>
+    <w:p>
+      <w:r>
+        <w:t>Who performs it: School Clinic staff.</w:t>
+      </w:r>
+    </w:p>
+    <w:p>
+      <w:pPr>
+        <w:pStyle w:val="Heading3"/>
+      </w:pPr>
+      <w:r>
+        <w:t>External (Applicant / Student / Third Party)</w:t>
+      </w:r>
+    </w:p>
+    <w:p>
+      <w:pPr>
+        <w:pStyle w:val="ListParagraph"/>
+        <w:numPr>
+          <w:numId w:val="0"/>
+        </w:numPr>
+      </w:pPr>
+      <w:r>
+        <w:t>Student receives hard copy health assessment forms and completes them.</w:t>
+      </w:r>
+    </w:p>
+    <w:p>
+      <w:pPr>
+        <w:pStyle w:val="List Paragraph"/>
+      </w:pPr>
+      <w:r>
+        <w:t>Student’s height and weight are measured and recorded.</w:t>
+      </w:r>
+    </w:p>
+    <w:p>
+      <w:pPr>
+        <w:pStyle w:val="ListParagraph"/>
+        <w:numPr>
+          <w:numId w:val="0"/>
+        </w:numPr>
+      </w:pPr>
+      <w:r>
+        <w:t>Student is registered for PhilHealth (if not already registered).</w:t>
+      </w:r>
+    </w:p>
+    <w:p>
+      <w:pPr>
+        <w:pStyle w:val="Heading3"/>
+      </w:pPr>
+      <w:r>
+        <w:t>Internal (Staff, Office, and System Actions/Decisions)</w:t>
+      </w:r>
+    </w:p>
+    <w:p>
+      <w:pPr>
+        <w:pStyle w:val="ListParagraph"/>
+        <w:numPr>
+          <w:numId w:val="0"/>
+        </w:numPr>
+      </w:pPr>
+      <w:r>
+        <w:t>Action: a ClinicRecords row is created against the student’s current Enrollments row, capturing heightCm, weightKg, bloodPressure, philhealthNumber, philhealthRegistered, assessmentNotes, and findings.</w:t>
+      </w:r>
+    </w:p>
+    <w:p>
+      <w:pPr>
+        <w:pStyle w:val="ListParagraph"/>
+        <w:numPr>
+          <w:numId w:val="0"/>
+        </w:numPr>
+      </w:pPr>
+      <w:r>
+        <w:t>Action: Clinic staff record a WorkflowSteps row for the School Clinic, signing the enrollment workflow process form.</w:t>
+      </w:r>
+    </w:p>
+    <w:p>
+      <w:pPr>
+        <w:pStyle w:val="ListParagraph"/>
+        <w:numPr>
+          <w:numId w:val="0"/>
+        </w:numPr>
+      </w:pPr>
+      <w:r>
+        <w:t>Action: clinicRecordId links to the ClinicRecords table; the enrollmentWorkflow stepOrder advances.</w:t>
+      </w:r>
+    </w:p>
+    <w:p>
+      <w:pPr>
+        <w:pStyle w:val="Heading3"/>
+      </w:pPr>
+      <w:r>
+        <w:t>Tables and Key Attributes Involved</w:t>
+      </w:r>
+    </w:p>
+    <w:p>
+      <w:pPr>
+        <w:pStyle w:val="ListParagraph"/>
+        <w:numPr>
+          <w:numId w:val="0"/>
+        </w:numPr>
+      </w:pPr>
+      <w:r>
+        <w:t>ClinicRecords: clinicRecordId (PK), enrollmentId (FK), heightCm, weightKg, bloodPressure, philhealthNumber, philhealthRegistered, assessmentNotes, findings, clinicStaffId (FK), assessmentDate, status.</w:t>
+      </w:r>
+    </w:p>
+    <w:p>
+      <w:pPr>
+        <w:pStyle w:val="ListParagraph"/>
+        <w:numPr>
+          <w:numId w:val="0"/>
+        </w:numPr>
+      </w:pPr>
+      <w:r>
+        <w:t>WorkflowSteps: workflowStepId (PK), workflowId (FK), officeId (FK), stepOrder, stepStatus, signedBy, signedDate.</w:t>
+      </w:r>
+    </w:p>
+    <w:p>
+      <w:pPr>
+        <w:pStyle w:val="Heading3"/>
+      </w:pPr>
+      <w:r>
+        <w:t>Relationships and Cardinality Active in This Phase</w:t>
+      </w:r>
+    </w:p>
+    <w:p>
+      <w:pPr>
+        <w:pStyle w:val="ListParagraph"/>
+        <w:numPr>
+          <w:numId w:val="0"/>
+        </w:numPr>
+      </w:pPr>
+      <w:r>
+        <w:t>Enrollments → ClinicRecords.enrollmentId (1:M, mandatory)</w:t>
+      </w:r>
+    </w:p>
+    <w:p>
+      <w:pPr>
+        <w:pStyle w:val="ListParagraph"/>
+        <w:numPr>
+          <w:numId w:val="0"/>
+        </w:numPr>
+      </w:pPr>
+      <w:r>
+        <w:t>StaffUsers → ClinicRecords.clinicStaffId (1:M, nullable)</w:t>
+      </w:r>
+    </w:p>
+    <w:p>
+      <w:pPr>
+        <w:pStyle w:val="ListParagraph"/>
+        <w:numPr>
+          <w:numId w:val="0"/>
+        </w:numPr>
+      </w:pPr>
+      <w:r>
+        <w:t>ClinicRecords → Enrollments.enrollmentId (1:1, mandatory — one clinic record per enrollment per term)</w:t>
+      </w:r>
+    </w:p>
+    <w:p>
+      <w:pPr>
+        <w:pStyle w:val="ListParagraph"/>
+        <w:numPr>
+          <w:numId w:val="0"/>
+        </w:numPr>
+      </w:pPr>
+      <w:r>
+        <w:t>Enrollments → EnrollmentWorkflow.enrollmentId (1:1, mandatory)</w:t>
+      </w:r>
+    </w:p>
+    <w:p>
+      <w:pPr>
+        <w:pStyle w:val="ListParagraph"/>
+        <w:numPr>
+          <w:numId w:val="0"/>
+        </w:numPr>
+      </w:pPr>
+      <w:r>
+        <w:t>EnrollmentWorkflow → WorkflowSteps.workflowId (1:M, mandatory)</w:t>
+      </w:r>
+    </w:p>
+    <w:p>
+      <w:pPr>
+        <w:pStyle w:val="ListParagraph"/>
+        <w:numPr>
+          <w:numId w:val="0"/>
+        </w:numPr>
+      </w:pPr>
+      <w:r>
+        <w:t>Offices → WorkflowSteps.officeId (1:M, mandatory — School Clinic is officeId=11)</w:t>
+      </w:r>
+    </w:p>
+    <w:p>
+      <w:pPr>
+        <w:pStyle w:val="ListParagraph"/>
+        <w:numPr>
+          <w:numId w:val="0"/>
+        </w:numPr>
+      </w:pPr>
+      <w:r>
+        <w:t>StaffUsers → WorkflowSteps.signedBy (1:M, nullable)</w:t>
+      </w:r>
+    </w:p>
+    <w:p>
+      <w:pPr>
+        <w:pStyle w:val="Heading3"/>
+      </w:pPr>
+      <w:r>
+        <w:t>Data Flow</w:t>
+      </w:r>
+    </w:p>
+    <w:p>
+      <w:pPr/>
+      <w:r>
+        <w:t>ClinicRecords row is INSERTed (heightCm, weightKg, bloodPressure, philhealthNumber, philhealthRegistered, assessmentNotes, findings). WorkflowSteps row for officeId=11 (School Clinic) gets stepStatus UPDATED to completed, with signedBy (staff user) and signedDate populated. EnrollmentWorkflow.currentStep is incremented.</w:t>
       </w:r>
     </w:p>
     <w:p>
@@ -3691,7 +3912,7 @@
         <w:spacing w:after="140" w:before="280"/>
       </w:pPr>
       <w:r>
-        <w:t xml:space="preserve">Phase 7 — ID Request and Release</w:t>
+        <w:t>Phase 8 — ID Request and Release</w:t>
       </w:r>
     </w:p>
     <w:p>
@@ -4070,7 +4291,7 @@
         <w:spacing w:after="140" w:before="280"/>
       </w:pPr>
       <w:r>
-        <w:t xml:space="preserve">Phase 8 — Mid-Course Qualifying Exam (Conditional)</w:t>
+        <w:t>Phase 9 — Mid-Course Qualifying Exam (Conditional)</w:t>
       </w:r>
     </w:p>
     <w:p>
@@ -4144,7 +4365,7 @@
         <w:spacing w:after="70"/>
       </w:pPr>
       <w:r>
-        <w:t xml:space="preserve">Action: record the result as a CourseExams row, tagged examStage='midCourseQualifying'.</w:t>
+        <w:t>Action: record the result as an ExamResults row, tagged examStage='midCourseQualifying'.</w:t>
       </w:r>
     </w:p>
     <w:p>
@@ -4213,7 +4434,7 @@
                 <w:sz w:val="18"/>
                 <w:szCs w:val="18"/>
               </w:rPr>
-              <w:t xml:space="preserve">CourseExams</w:t>
+              <w:t>ExamResults</w:t>
             </w:r>
           </w:p>
         </w:tc>
@@ -4281,7 +4502,7 @@
         <w:spacing w:after="70"/>
       </w:pPr>
       <w:r>
-        <w:t xml:space="preserve">Students → CourseExams.studentId (1:M, mandatory)</w:t>
+        <w:t>Students → ExamResults.studentId (1:M, mandatory)</w:t>
       </w:r>
     </w:p>
     <w:p>
@@ -4294,7 +4515,7 @@
         <w:spacing w:after="70"/>
       </w:pPr>
       <w:r>
-        <w:t xml:space="preserve">Courses → CourseExams.courseId (1:M, mandatory)</w:t>
+        <w:t>Courses → ExamResults.courseId (1:M, mandatory)</w:t>
       </w:r>
     </w:p>
     <w:p>
@@ -4307,7 +4528,7 @@
         <w:spacing w:after="70"/>
       </w:pPr>
       <w:r>
-        <w:t xml:space="preserve">AcademicTerms → CourseExams.termId (1:M, mandatory)</w:t>
+        <w:t>AcademicTerms → ExamResults.termId (1:M, mandatory)</w:t>
       </w:r>
     </w:p>
     <w:p>
@@ -4345,11 +4566,9 @@
           <w:b/>
           <w:bCs/>
         </w:rPr>
-        <w:t xml:space="preserve">Notifications:</w:t>
-      </w:r>
-      <w:r>
-        <w:t xml:space="preserve"> Fires at every status change across every phase above (approval, rejection, clearance status, scholarship status) — optional for a face-to-face-first MVP, essential once online support expands.</w:t>
-      </w:r>
+        <w:t>Notifications (removed): Was originally a status-change messaging table. Removed in a later revision to avoid over-engineering for the face-to-face-first MVP. A lighter notification mechanism can be re-implemented when online support expands.</w:t>
+      </w:r>
+      <w:r/>
     </w:p>
     <w:p>
       <w:pPr>
@@ -4983,7 +5202,7 @@
         <w:spacing w:after="190" w:before="380"/>
       </w:pPr>
       <w:r>
-        <w:t xml:space="preserve">3. Complete Data Dictionary (46 Tables)</w:t>
+        <w:t>3. Complete Data Dictionary (45 tables)</w:t>
       </w:r>
     </w:p>
     <w:p>
@@ -6684,7 +6903,7 @@
           <w:sz w:val="16"/>
           <w:szCs w:val="16"/>
         </w:rPr>
-        <w:t xml:space="preserve">Referenced by: Guardians.studentId (1:M); Addresses.studentId (1:M); StudentEducationalBackgrounds.studentId (1:M); CourseExams.studentId (1:M); Admissions.studentId (1:M); Enrollments.studentId (1:M); TransferAcademicRecords.studentId (1:M); StudentScholarships.studentId (1:M); StudentClearances.studentId (1:M); StudentIds.studentId (1:M); Notifications.studentId (1:M)</w:t>
+        <w:t>Referenced by: Guardians.studentId (1:M); Addresses.studentId (1:M); StudentEducationalBackgrounds.studentId (1:M); ExamResults.studentId (1:M); Admissions.studentId (1:M); Enrollments.studentId (1:M); TransferAcademicRecords.studentId (1:M); StudentScholarships.studentId (1:M); StudentClearances.studentId (1:M); StudentIds.studentId (1:M); Notifications.studentId (1:M)</w:t>
       </w:r>
     </w:p>
     <w:p>
@@ -11982,7 +12201,7 @@
           <w:sz w:val="16"/>
           <w:szCs w:val="16"/>
         </w:rPr>
-        <w:t xml:space="preserve">Referenced by: Majors.courseId (1:M); Curriculums.courseId (1:M); CourseExams.courseId (1:M); Admissions.courseId (1:M); Enrollments.courseId (1:M); Sections.courseId (1:M)</w:t>
+        <w:t>Referenced by: Majors.courseId (1:M); Curriculums.courseId (1:M); ExamResults.courseId (1:M); Admissions.courseId (1:M); Enrollments.courseId (1:M); Blocks.courseId (1:M)</w:t>
       </w:r>
     </w:p>
     <w:p>
@@ -15163,7 +15382,7 @@
         <w:spacing w:after="100" w:before="200"/>
       </w:pPr>
       <w:r>
-        <w:t xml:space="preserve">CourseExams</w:t>
+        <w:t>ExamResults</w:t>
       </w:r>
     </w:p>
     <w:p>
@@ -15957,6 +16176,38 @@
           </w:p>
         </w:tc>
       </w:tr>
+      <w:tr>
+        <w:tc>
+          <w:tcPr>
+            <w:tcW w:type="dxa" w:w="2200"/>
+          </w:tcPr>
+          <w:p>
+            <w:r>
+              <w:t>examType</w:t>
+            </w:r>
+          </w:p>
+        </w:tc>
+        <w:tc>
+          <w:tcPr>
+            <w:tcW w:type="dxa" w:w="1400"/>
+          </w:tcPr>
+          <w:p>
+            <w:r>
+              <w:t>VARCHAR(50)</w:t>
+            </w:r>
+          </w:p>
+        </w:tc>
+        <w:tc>
+          <w:tcPr>
+            <w:tcW w:type="dxa" w:w="5760"/>
+          </w:tcPr>
+          <w:p>
+            <w:r>
+              <w:t>'general'</w:t>
+            </w:r>
+          </w:p>
+        </w:tc>
+      </w:tr>
     </w:tbl>
     <w:p>
       <w:pPr>
@@ -19174,7 +19425,7 @@
           <w:sz w:val="16"/>
           <w:szCs w:val="16"/>
         </w:rPr>
-        <w:t xml:space="preserve">Referenced by: CourseExams.termId (1:M); Admissions.termId (1:M); Enrollments.termId (1:M); StudentScholarships.termId (1:M); ClearancePeriods.termId (1:M); Sections.termId (1:M)</w:t>
+        <w:t>Referenced by: ExamResults.termId (1:M); Admissions.termId (1:M); Enrollments.termId (1:M); StudentScholarships.termId (1:M); ClearancePeriods.termId (1:M); Blocks.termId (1:M)</w:t>
       </w:r>
     </w:p>
     <w:p>
@@ -22115,7 +22366,7 @@
                 <w:sz w:val="18"/>
                 <w:szCs w:val="18"/>
               </w:rPr>
-              <w:t xml:space="preserve">→ Sections.1:M</w:t>
+              <w:t>→ Blocks.1:M</w:t>
             </w:r>
           </w:p>
         </w:tc>
@@ -25351,6 +25602,38 @@
           </w:p>
         </w:tc>
       </w:tr>
+      <w:tr>
+        <w:tc>
+          <w:tcPr>
+            <w:tcW w:type="dxa" w:w="2200"/>
+          </w:tcPr>
+          <w:p>
+            <w:r>
+              <w:t>awardedBeforeEnrollment</w:t>
+            </w:r>
+          </w:p>
+        </w:tc>
+        <w:tc>
+          <w:tcPr>
+            <w:tcW w:type="dxa" w:w="1400"/>
+          </w:tcPr>
+          <w:p>
+            <w:r>
+              <w:t>TINYINT(1)</w:t>
+            </w:r>
+          </w:p>
+        </w:tc>
+        <w:tc>
+          <w:tcPr>
+            <w:tcW w:type="dxa" w:w="5760"/>
+          </w:tcPr>
+          <w:p>
+            <w:r>
+              <w:t>0</w:t>
+            </w:r>
+          </w:p>
+        </w:tc>
+      </w:tr>
     </w:tbl>
     <w:p>
       <w:pPr>
@@ -30758,7 +31041,7 @@
         <w:spacing w:after="100" w:before="200"/>
       </w:pPr>
       <w:r>
-        <w:t xml:space="preserve">Sections</w:t>
+        <w:t>Blocks</w:t>
       </w:r>
     </w:p>
     <w:p>
@@ -31805,7 +32088,7 @@
                 <w:sz w:val="18"/>
                 <w:szCs w:val="18"/>
               </w:rPr>
-              <w:t xml:space="preserve">→ Sections.1:M</w:t>
+              <w:t>→ Blocks.1:M</w:t>
             </w:r>
           </w:p>
         </w:tc>
@@ -37206,7 +37489,7 @@
         <w:spacing w:after="140" w:before="280"/>
       </w:pPr>
       <w:r>
-        <w:t xml:space="preserve">Module 11 — Notifications and Reports</w:t>
+        <w:t>Module 11 — Reports and Document Tracking</w:t>
       </w:r>
     </w:p>
     <w:p>
@@ -37228,7 +37511,7 @@
         <w:spacing w:after="100" w:before="200"/>
       </w:pPr>
       <w:r>
-        <w:t xml:space="preserve">Notifications  (OPTIONAL)</w:t>
+        <w:t>[REMOVED] Notifications</w:t>
       </w:r>
     </w:p>
     <w:p>
@@ -37288,7 +37571,9 @@
                 <w:sz w:val="18"/>
                 <w:szCs w:val="18"/>
               </w:rPr>
-              <w:t xml:space="preserve">Attribute</w:t>
+            </w:r>
+            <w:r>
+              <w:t>[REMOVED]</w:t>
             </w:r>
           </w:p>
         </w:tc>
@@ -37320,7 +37605,6 @@
                 <w:sz w:val="18"/>
                 <w:szCs w:val="18"/>
               </w:rPr>
-              <w:t xml:space="preserve">Key</w:t>
             </w:r>
           </w:p>
         </w:tc>
@@ -37352,7 +37636,6 @@
                 <w:sz w:val="18"/>
                 <w:szCs w:val="18"/>
               </w:rPr>
-              <w:t xml:space="preserve">References</w:t>
             </w:r>
           </w:p>
         </w:tc>
@@ -37385,7 +37668,6 @@
                 <w:sz w:val="18"/>
                 <w:szCs w:val="18"/>
               </w:rPr>
-              <w:t xml:space="preserve">notificationId</w:t>
             </w:r>
           </w:p>
         </w:tc>
@@ -37416,7 +37698,6 @@
                 <w:sz w:val="18"/>
                 <w:szCs w:val="18"/>
               </w:rPr>
-              <w:t xml:space="preserve">PK</w:t>
             </w:r>
           </w:p>
         </w:tc>
@@ -37447,7 +37728,6 @@
                 <w:sz w:val="18"/>
                 <w:szCs w:val="18"/>
               </w:rPr>
-              <w:t xml:space="preserve"/>
             </w:r>
           </w:p>
         </w:tc>
@@ -37480,7 +37760,6 @@
                 <w:sz w:val="18"/>
                 <w:szCs w:val="18"/>
               </w:rPr>
-              <w:t xml:space="preserve">studentId</w:t>
             </w:r>
           </w:p>
         </w:tc>
@@ -37511,7 +37790,6 @@
                 <w:sz w:val="18"/>
                 <w:szCs w:val="18"/>
               </w:rPr>
-              <w:t xml:space="preserve">FK</w:t>
             </w:r>
           </w:p>
         </w:tc>
@@ -37542,7 +37820,6 @@
                 <w:sz w:val="18"/>
                 <w:szCs w:val="18"/>
               </w:rPr>
-              <w:t xml:space="preserve">→ Students.1:M</w:t>
             </w:r>
           </w:p>
         </w:tc>
@@ -37575,7 +37852,6 @@
                 <w:sz w:val="18"/>
                 <w:szCs w:val="18"/>
               </w:rPr>
-              <w:t xml:space="preserve">message</w:t>
             </w:r>
           </w:p>
         </w:tc>
@@ -37606,7 +37882,6 @@
                 <w:sz w:val="18"/>
                 <w:szCs w:val="18"/>
               </w:rPr>
-              <w:t xml:space="preserve"/>
             </w:r>
           </w:p>
         </w:tc>
@@ -37637,7 +37912,6 @@
                 <w:sz w:val="18"/>
                 <w:szCs w:val="18"/>
               </w:rPr>
-              <w:t xml:space="preserve"/>
             </w:r>
           </w:p>
         </w:tc>
@@ -37670,7 +37944,6 @@
                 <w:sz w:val="18"/>
                 <w:szCs w:val="18"/>
               </w:rPr>
-              <w:t xml:space="preserve">channel</w:t>
             </w:r>
           </w:p>
         </w:tc>
@@ -37701,7 +37974,6 @@
                 <w:sz w:val="18"/>
                 <w:szCs w:val="18"/>
               </w:rPr>
-              <w:t xml:space="preserve"/>
             </w:r>
           </w:p>
         </w:tc>
@@ -37732,7 +38004,6 @@
                 <w:sz w:val="18"/>
                 <w:szCs w:val="18"/>
               </w:rPr>
-              <w:t xml:space="preserve"/>
             </w:r>
           </w:p>
         </w:tc>
@@ -37765,7 +38036,6 @@
                 <w:sz w:val="18"/>
                 <w:szCs w:val="18"/>
               </w:rPr>
-              <w:t xml:space="preserve">sentDate</w:t>
             </w:r>
           </w:p>
         </w:tc>
@@ -37796,7 +38066,6 @@
                 <w:sz w:val="18"/>
                 <w:szCs w:val="18"/>
               </w:rPr>
-              <w:t xml:space="preserve"/>
             </w:r>
           </w:p>
         </w:tc>
@@ -37827,7 +38096,6 @@
                 <w:sz w:val="18"/>
                 <w:szCs w:val="18"/>
               </w:rPr>
-              <w:t xml:space="preserve"/>
             </w:r>
           </w:p>
         </w:tc>
@@ -37860,7 +38128,6 @@
                 <w:sz w:val="18"/>
                 <w:szCs w:val="18"/>
               </w:rPr>
-              <w:t xml:space="preserve">status</w:t>
             </w:r>
           </w:p>
         </w:tc>
@@ -37891,7 +38158,6 @@
                 <w:sz w:val="18"/>
                 <w:szCs w:val="18"/>
               </w:rPr>
-              <w:t xml:space="preserve"/>
             </w:r>
           </w:p>
         </w:tc>
@@ -37922,7 +38188,6 @@
                 <w:sz w:val="18"/>
                 <w:szCs w:val="18"/>
               </w:rPr>
-              <w:t xml:space="preserve"/>
             </w:r>
           </w:p>
         </w:tc>
@@ -40042,7 +40307,7 @@
         <w:spacing w:after="190" w:before="380"/>
       </w:pPr>
       <w:r>
-        <w:t xml:space="preserve">4. Why This System Uses 46 Tables</w:t>
+        <w:t>4. Why This System Uses 45 tables</w:t>
       </w:r>
     </w:p>
     <w:p>
@@ -40084,7 +40349,7 @@
         <w:spacing w:after="140"/>
       </w:pPr>
       <w:r>
-        <w:t xml:space="preserve">Every foreign key enforces a real constraint the school actually needs: a Payments row can't exist without a real Enrollments row behind it; a ClearanceApprovals row can't exist without a real office and a real clearance case. The two UNIQUE constraints added during validation (one clearance per student per term, one active scholarship per student per term) push business rules the school confirmed as always-true down into the database itself, so a bug or a double-click can't silently create an impossible row.</w:t>
+        <w:t>Every foreign key enforces a real constraint the school actually needs: a Payments row can't exist without a real Enrollments row behind it; a ClearanceApprovals row can't exist without a real office and a real clearance case. The six UNIQUE constraints added during validation (one clearance per student per term, one active scholarship per student per term) push business rules the school confirmed as always-true down into the database itself, so a bug or a double-click can't silently create an impossible row. Five performance indexes were also added (idx_students_names on lastName/firstName, idx_payments_or on orNumber, idx_schedules_lookup on sectionId/subjectId, idx_studentscholarships_lookup on studentId/termId, and idx_examresults_student on studentId/courseId/termId) to accelerate the most frequent lookup patterns without premature optimization of every column.</w:t>
       </w:r>
     </w:p>
     <w:p>
@@ -40164,7 +40429,7 @@
           <w:b/>
           <w:bCs/>
         </w:rPr>
-        <w:t xml:space="preserve">Every one of the 46 tables can be traced to one of these six angles when asked "why does this exist" — and where a table's value depended on a school policy that couldn't be confirmed from the documents provided (fee calculation, standardized religion reporting, reprint-fraud tracking), it was marked optional rather than built in as if it were certain.</w:t>
+        <w:t>Every one of the 45 tables can be traced to one of these six angles when asked "why does this exist" — and where a table's value depended on a school policy that couldn't be confirmed from the documents provided (fee calculation, standardized religion reporting, reprint-fraud tracking), it was marked optional rather than built in as if it were certain.</w:t>
       </w:r>
     </w:p>
     <w:sectPr>

</xml_diff>

<commit_message>
Fix 9 schema-documentation inconsistencies from consistency audit
Issues resolved:
- Database_Representations.md: FK count (7→78), ERD academicschedule→academicterms,
  scholarshipstypes→scholarshiptypes (9x), AUTO_INCREMENT claims corrected,
  composite UNIQUE constraints added
- EMS Complete Documentation.docx: '45 tables'→'46 tables' (4x),
  removed stale Notifications.studentId reference
- Enrollment_System_Dialogue.md: scholarshipstypes→scholarshiptypes
- enrollment.sql: renamed examresults fk_courseexams_*→fk_examresults_*,
  dropped redundant indexes (idx_payments_or, fk_schedules_sectionid KEY),
  made admissions.evaluatedBy/evaluatedDate and enrollments.registrarProcessedBy nullable
- Added Docs_vs_SQL_Consistency_Report.md documenting the full audit
</commit_message>
<xml_diff>
--- a/Documentation/EMS Complete Documentation.docx
+++ b/Documentation/EMS Complete Documentation.docx
@@ -60,7 +60,7 @@
           <w:sz w:val="20"/>
           <w:szCs w:val="20"/>
         </w:rPr>
-        <w:t>45 tables, 76 relationships — validated schema</w:t>
+        <w:t>46 tables, 78 foreign-key constraints — validated schema</w:t>
       </w:r>
     </w:p>
     <w:p>
@@ -5202,7 +5202,7 @@
         <w:spacing w:after="190" w:before="380"/>
       </w:pPr>
       <w:r>
-        <w:t>3. Complete Data Dictionary (45 tables)</w:t>
+        <w:t>3. Complete Data Dictionary (46 tables)</w:t>
       </w:r>
     </w:p>
     <w:p>
@@ -6903,7 +6903,7 @@
           <w:sz w:val="16"/>
           <w:szCs w:val="16"/>
         </w:rPr>
-        <w:t>Referenced by: Guardians.studentId (1:M); Addresses.studentId (1:M); StudentEducationalBackgrounds.studentId (1:M); ExamResults.studentId (1:M); Admissions.studentId (1:M); Enrollments.studentId (1:M); TransferAcademicRecords.studentId (1:M); StudentScholarships.studentId (1:M); StudentClearances.studentId (1:M); StudentIds.studentId (1:M); Notifications.studentId (1:M)</w:t>
+        <w:t>Referenced by: Guardians.studentId (1:M); Addresses.studentId (1:M); StudentEducationalBackgrounds.studentId (1:M); ExamResults.studentId (1:M); Admissions.studentId (1:M); Enrollments.studentId (1:M); TransferAcademicRecords.studentId (1:M); StudentScholarships.studentId (1:M); StudentClearances.studentId (1:M); StudentIds.studentId (1:M); </w:t>
       </w:r>
     </w:p>
     <w:p>
@@ -40307,7 +40307,7 @@
         <w:spacing w:after="190" w:before="380"/>
       </w:pPr>
       <w:r>
-        <w:t>4. Why This System Uses 45 tables</w:t>
+        <w:t>4. Why This System Uses 46 tables</w:t>
       </w:r>
     </w:p>
     <w:p>
@@ -40429,7 +40429,7 @@
           <w:b/>
           <w:bCs/>
         </w:rPr>
-        <w:t>Every one of the 45 tables can be traced to one of these six angles when asked "why does this exist" — and where a table's value depended on a school policy that couldn't be confirmed from the documents provided (fee calculation, standardized religion reporting, reprint-fraud tracking), it was marked optional rather than built in as if it were certain.</w:t>
+        <w:t>Every one of the 46 tables can be traced to one of these six angles when asked "why does this exist" — and where a table's value depended on a school policy that couldn't be confirmed from the documents provided (fee calculation, standardized religion reporting, reprint-fraud tracking), it was marked optional rather than built in as if it were certain.</w:t>
       </w:r>
     </w:p>
     <w:sectPr>

</xml_diff>

<commit_message>
Align schema and docs with real enrollment process (blocks rename, two-stage entrance exam, retention exam, clinic physical exam, School Grant, Accounting, ID Office)
</commit_message>
<xml_diff>
--- a/Documentation/EMS Complete Documentation.docx
+++ b/Documentation/EMS Complete Documentation.docx
@@ -115,7 +115,7 @@
         <w:spacing w:after="140"/>
       </w:pPr>
       <w:r>
-        <w:t xml:space="preserve">This system digitalizes a face-to-face enrollment process at SEAIT, without changing the process itself — every physical step (submitting documents at a window, obtaining a signature, paying at the Cashier) still happens the same way. What changes is that each step now writes to a database instead of only a paper form, so the school gains tracking, reporting, and a foundation for optional online support later, without students experiencing a different process today.</w:t>
+        <w:t>This system digitalizes a face-to-face enrollment process at SEAIT, without changing the process itself — every physical step (submitting documents at a window, obtaining a signature, paying at Accounting) still happens the same way. What changes is that each step now writes to a database instead of only a paper form, so the school gains tracking, reporting, and a foundation for optional online support later, without students experiencing a different process today.</w:t>
       </w:r>
     </w:p>
     <w:p>
@@ -284,19 +284,6 @@
       </w:pPr>
       <w:r>
         <w:t xml:space="preserve">Applicant brings physical documents (Report Card, Good Moral, PSA Birth Certificate, Diploma, BIR/ITR Certification) to the Admission Office window, or uploads scanned copies through the portal.</w:t>
-      </w:r>
-    </w:p>
-    <w:p>
-      <w:pPr>
-        <w:pStyle w:val="ListParagraph"/>
-        <w:numPr>
-          <w:ilvl w:val="0"/>
-          <w:numId w:val="1"/>
-        </w:numPr>
-        <w:spacing w:after="70"/>
-      </w:pPr>
-      <w:r>
-        <w:t xml:space="preserve">Applicant completes the school's Physical Examination (always in person, regardless of application mode).</w:t>
       </w:r>
     </w:p>
     <w:p>
@@ -853,11 +840,9 @@
           <w:b/>
           <w:bCs/>
         </w:rPr>
-        <w:t xml:space="preserve">Purpose:</w:t>
-      </w:r>
-      <w:r>
-        <w:t xml:space="preserve"> Gate admission for Courses that require it.</w:t>
-      </w:r>
+        <w:t>Purpose: Gate admission for board Courses that require it, in two stages — a general entrance exam administered by the Guidance Office, then a course-specific exam administered by the Academic Department.</w:t>
+      </w:r>
+      <w:r/>
     </w:p>
     <w:p>
       <w:pPr>
@@ -868,11 +853,9 @@
           <w:b/>
           <w:bCs/>
         </w:rPr>
-        <w:t xml:space="preserve">Who performs it:</w:t>
-      </w:r>
-      <w:r>
-        <w:t xml:space="preserve"> Whichever office administers entrance exams (typically Academic Department staff); the applicant.</w:t>
-      </w:r>
+        <w:t>Who performs it: Guidance Office (general entrance exam); Academic Department (course-specific entrance exam); the applicant.</w:t>
+      </w:r>
+      <w:r/>
     </w:p>
     <w:p>
       <w:pPr>
@@ -893,7 +876,7 @@
         <w:spacing w:after="70"/>
       </w:pPr>
       <w:r>
-        <w:t xml:space="preserve">Applicant takes the entrance exam, on the schedule the school sets, before or during the Admission Office step.</w:t>
+        <w:t>Applicant takes the general entrance exam administered by the Guidance Office, then — for board courses — the course-specific exam administered by the Academic Department, on the schedules the school sets, before or during the Admission Office step.</w:t>
       </w:r>
     </w:p>
     <w:p>
@@ -915,7 +898,7 @@
         <w:spacing w:after="70"/>
       </w:pPr>
       <w:r>
-        <w:t>Action: record the result as an ExamResults row, tagged examStage='entrance'.</w:t>
+        <w:t>Action: record each stage as its own ExamResults row — examStage='entrance' with examType='general' (Guidance Office) or examType='courseSpecific' (Academic Department).</w:t>
       </w:r>
     </w:p>
     <w:p>
@@ -928,7 +911,7 @@
         <w:spacing w:after="70"/>
       </w:pPr>
       <w:r>
-        <w:t xml:space="preserve">Decision: a failed entrance exam can be checked before Admissions.admissionStatus is set to approved, for Courses where requiresEntranceExam is true.</w:t>
+        <w:t>Decision: the Academic Department must pull and verify the Guidance general-exam result before the applicant is allowed to take the course-specific exam; a failed result at either stage is checked before Admissions.admissionStatus is set to approved, for Courses where requiresEntranceExam is true.</w:t>
       </w:r>
     </w:p>
     <w:p>
@@ -1095,7 +1078,7 @@
         <w:spacing w:after="140"/>
       </w:pPr>
       <w:r>
-        <w:t>This step only produces data for Courses with requiresEntranceExam=true; for every other Course, this phase is skipped entirely and no ExamResults row is created.</w:t>
+        <w:t>This step only produces data for Courses with requiresEntranceExam=true (board courses); for every other Course this phase is skipped entirely. Board-course applicants produce two ExamResults rows (general + courseSpecific), both under examStage='entrance'.</w:t>
       </w:r>
     </w:p>
     <w:p>
@@ -1116,11 +1099,9 @@
           <w:b/>
           <w:bCs/>
         </w:rPr>
-        <w:t xml:space="preserve">Purpose:</w:t>
-      </w:r>
-      <w:r>
-        <w:t xml:space="preserve"> Confirm the student's Course/Major, evaluate prior standing, and set the term's subject load.</w:t>
-      </w:r>
+        <w:t>Purpose: Issue the enrollment form, confirm the student's Course/Major, evaluate prior standing, and set the term's subject load.</w:t>
+      </w:r>
+      <w:r/>
     </w:p>
     <w:p>
       <w:pPr>
@@ -1156,7 +1137,7 @@
         <w:spacing w:after="70"/>
       </w:pPr>
       <w:r>
-        <w:t xml:space="preserve">First-year/transferee: proceed to the department, in person or via portal.</w:t>
+        <w:t>Student lines up, receives the enrollment form, and fills in the required personal and term information.</w:t>
       </w:r>
     </w:p>
     <w:p>
@@ -1169,7 +1150,7 @@
         <w:spacing w:after="70"/>
       </w:pPr>
       <w:r>
-        <w:t xml:space="preserve">Continuing/irregular: present clearance from the prior term (see Phase 2) instead of admission documents.</w:t>
+        <w:t>Board-course continuing students (2nd–5th year) first take the retention exam (see the Decision below) before the enrollment form is issued and evaluated.</w:t>
       </w:r>
     </w:p>
     <w:p>
@@ -1182,7 +1163,7 @@
         <w:spacing w:after="70"/>
       </w:pPr>
       <w:r>
-        <w:t xml:space="preserve">Transferee/shifter: bring prior academic records for crediting.</w:t>
+        <w:t>Transferee/shifter: bring prior academic records for crediting. Some colleges may also ask for the prior term's clearance here (optional at this phase; it becomes mandatory at the Registrar, see Phase 5).</w:t>
       </w:r>
     </w:p>
     <w:p>
@@ -1204,7 +1185,7 @@
         <w:spacing w:after="70"/>
       </w:pPr>
       <w:r>
-        <w:t xml:space="preserve">Decision: for continuing/irregular students, evaluate the prior term's EnrolledSubjects.grade values against GradeScale to determine passing/failing, setting the new Enrollments.academicStanding to 'regular' or 'irregular'.</w:t>
+        <w:t>Decision: for continuing/irregular students in board courses, check the retention exam result (ExamResults with examStage='retention') first — a failed result blocks the enrollment form. Then evaluate the prior term's EnrolledSubjects.grade values against GradeScale to determine passing/failing, setting the new Enrollments.academicStanding to 'regular' or 'irregular'.</w:t>
       </w:r>
     </w:p>
     <w:p>
@@ -1243,7 +1224,7 @@
         <w:spacing w:after="70"/>
       </w:pPr>
       <w:r>
-        <w:t xml:space="preserve">Action: record the evaluator on Enrollments.evaluatedBy.</w:t>
+        <w:t>Action: record the evaluator on Enrollments.evaluatedBy; the evaluator signs the enrollment form with the subject load.</w:t>
       </w:r>
     </w:p>
     <w:p>
@@ -2211,11 +2192,9 @@
           <w:b/>
           <w:bCs/>
         </w:rPr>
-        <w:t xml:space="preserve">Who performs it:</w:t>
-      </w:r>
-      <w:r>
-        <w:t xml:space="preserve"> Scholarship Office (award verification); Cashier or Accounting (if the fuller fee-calculation module is in use).</w:t>
-      </w:r>
+        <w:t>Who performs it: Scholarship Office (award verification); Accounting (if the fuller fee-calculation module is in use).</w:t>
+      </w:r>
+      <w:r/>
     </w:p>
     <w:p>
       <w:pPr>
@@ -2236,7 +2215,7 @@
         <w:spacing w:after="70"/>
       </w:pPr>
       <w:r>
-        <w:t xml:space="preserve">Student may present scholarship documentation (first encounter) or simply be already on file from a prior term.</w:t>
+        <w:t>Student may present scholarship documentation (first encounter) or simply be already on file from a prior term. At SEAIT, the school itself is a free-tuition school: every student is automatically covered by the School Grant (Free Tuition) ScholarshipType (100% coverage); outside grants stack on top, but total coverage cannot exceed 100%.</w:t>
       </w:r>
     </w:p>
     <w:p>
@@ -2258,7 +2237,7 @@
         <w:spacing w:after="70"/>
       </w:pPr>
       <w:r>
-        <w:t xml:space="preserve">Decision: check for an active StudentScholarships row for this student and term.</w:t>
+        <w:t>Decision: every SEAIT student carries the School Grant (Free Tuition) award; check for any additional outside-grant StudentScholarships rows for this student and term, applied on top up to the 100% cap.</w:t>
       </w:r>
     </w:p>
     <w:p>
@@ -2601,7 +2580,7 @@
         <w:spacing w:after="140" w:before="280"/>
       </w:pPr>
       <w:r>
-        <w:t xml:space="preserve">Phase 4 — Cashier (Payment)</w:t>
+        <w:t>Phase 4 — Accounting (Payment)</w:t>
       </w:r>
     </w:p>
     <w:p>
@@ -2628,11 +2607,9 @@
           <w:b/>
           <w:bCs/>
         </w:rPr>
-        <w:t xml:space="preserve">Who performs it:</w:t>
-      </w:r>
-      <w:r>
-        <w:t xml:space="preserve"> Cashier staff; the student.</w:t>
-      </w:r>
+        <w:t>Who performs it: Accounting staff; the student.</w:t>
+      </w:r>
+      <w:r/>
     </w:p>
     <w:p>
       <w:pPr>
@@ -2688,7 +2665,7 @@
         <w:spacing w:after="70"/>
       </w:pPr>
       <w:r>
-        <w:t xml:space="preserve">Action: record a WorkflowSteps row for Cashier.</w:t>
+        <w:t>Action: record a WorkflowSteps row for Accounting.</w:t>
       </w:r>
     </w:p>
     <w:p>
@@ -3216,11 +3193,9 @@
           <w:b/>
           <w:bCs/>
         </w:rPr>
-        <w:t xml:space="preserve">Purpose:</w:t>
-      </w:r>
-      <w:r>
-        <w:t xml:space="preserve"> Assign the student to a section and finalize their class schedule.</w:t>
-      </w:r>
+        <w:t>Purpose: Assign the student to a block and finalize their class schedule.</w:t>
+      </w:r>
+      <w:r/>
     </w:p>
     <w:p>
       <w:pPr>
@@ -3391,7 +3366,7 @@
                 <w:sz w:val="18"/>
                 <w:szCs w:val="18"/>
               </w:rPr>
-              <w:t xml:space="preserve">sectionId, courseId, termId, yearLevel, sectionName, maxStudents</w:t>
+              <w:t>blockId, courseId, termId, yearLevel, blockName, maxStudents</w:t>
             </w:r>
           </w:p>
         </w:tc>
@@ -3455,7 +3430,7 @@
                 <w:sz w:val="18"/>
                 <w:szCs w:val="18"/>
               </w:rPr>
-              <w:t xml:space="preserve">scheduleId, sectionId, subjectId, instructorId, roomId</w:t>
+              <w:t>scheduleId, blockId, subjectId, instructorId, roomId</w:t>
             </w:r>
           </w:p>
         </w:tc>
@@ -3582,7 +3557,7 @@
         <w:spacing w:after="70"/>
       </w:pPr>
       <w:r>
-        <w:t>Blocks → Schedules.sectionId (1:M, mandatory)</w:t>
+        <w:t>Blocks → Schedules.blockId (1:M, mandatory)</w:t>
       </w:r>
     </w:p>
     <w:p>
@@ -3647,7 +3622,7 @@
         <w:spacing w:after="70"/>
       </w:pPr>
       <w:r>
-        <w:t>Blocks → EnrolledSubjects.sectionId (1:M, mandatory)</w:t>
+        <w:t>Blocks → EnrolledSubjects.blockId (1:M, mandatory)</w:t>
       </w:r>
     </w:p>
     <w:p>
@@ -3690,7 +3665,7 @@
     </w:p>
     <w:p>
       <w:r>
-        <w:t>Purpose: Perform health assessments, record height/weight, administer PhilHealth registration, and sign the enrollment workflow form.</w:t>
+        <w:t>Purpose: Perform the physical examination and health assessments, record height/weight/blood pressure, administer PhilHealth registration, and sign the enrollment workflow form.</w:t>
       </w:r>
     </w:p>
     <w:p>
@@ -3722,7 +3697,7 @@
         <w:pStyle w:val="List Paragraph"/>
       </w:pPr>
       <w:r>
-        <w:t>Student’s height and weight are measured and recorded.</w:t>
+        <w:t>Student’s height, weight, and blood pressure are measured and recorded during the physical examination.</w:t>
       </w:r>
     </w:p>
     <w:p>
@@ -3912,7 +3887,7 @@
         <w:spacing w:after="140" w:before="280"/>
       </w:pPr>
       <w:r>
-        <w:t>Phase 8 — ID Request and Release</w:t>
+        <w:t>Phase 8 — ID Request, Release and Validation</w:t>
       </w:r>
     </w:p>
     <w:p>
@@ -4343,7 +4318,7 @@
         <w:spacing w:after="70"/>
       </w:pPr>
       <w:r>
-        <w:t xml:space="preserve">Student takes the qualifying/retention exam before advancing to the relevant year level.</w:t>
+        <w:t>Student takes the mid-course qualifying exam before advancing to the relevant year level. (The retention exam is not part of this phase — continuing board-course students take it in Phase 1, before the enrollment form.)</w:t>
       </w:r>
     </w:p>
     <w:p>
@@ -4545,7 +4520,7 @@
         <w:spacing w:after="140"/>
       </w:pPr>
       <w:r>
-        <w:t xml:space="preserve">Structurally identical to Phase 0.5's entrance exam — same table, different examStage value, distinguishing the two without needing two different tables.</w:t>
+        <w:t>Structurally identical to Phase 0.5's entrance exam — same table, different examStage value, distinguishing the two without needing two different tables (entrance exams additionally use examType to separate the Guidance general exam from the department course-specific exam).</w:t>
       </w:r>
     </w:p>
     <w:p>
@@ -22304,7 +22279,7 @@
                 <w:sz w:val="18"/>
                 <w:szCs w:val="18"/>
               </w:rPr>
-              <w:t xml:space="preserve">sectionId</w:t>
+              <w:t>blockId</w:t>
             </w:r>
           </w:p>
         </w:tc>
@@ -31198,7 +31173,7 @@
                 <w:sz w:val="18"/>
                 <w:szCs w:val="18"/>
               </w:rPr>
-              <w:t xml:space="preserve">sectionId</w:t>
+              <w:t>blockId</w:t>
             </w:r>
           </w:p>
         </w:tc>
@@ -31578,7 +31553,7 @@
                 <w:sz w:val="18"/>
                 <w:szCs w:val="18"/>
               </w:rPr>
-              <w:t xml:space="preserve">sectionName</w:t>
+              <w:t>blockName</w:t>
             </w:r>
           </w:p>
         </w:tc>
@@ -31753,7 +31728,7 @@
           <w:sz w:val="16"/>
           <w:szCs w:val="16"/>
         </w:rPr>
-        <w:t xml:space="preserve">Referenced by: EnrolledSubjects.sectionId (1:M); Schedules.sectionId (1:M)</w:t>
+        <w:t>Referenced by: EnrolledSubjects.blockId (1:M); Schedules.blockId (1:M)</w:t>
       </w:r>
     </w:p>
     <w:p>
@@ -31782,7 +31757,7 @@
         <w:spacing w:after="140"/>
       </w:pPr>
       <w:r>
-        <w:t xml:space="preserve">One subject's assignment to a section — instructor and room — with meeting details held underneath. Role in workflow: what a student's EnrolledSubjects rows link to for room/instructor/time.</w:t>
+        <w:t>One subject's assignment to a block — instructor and room — with meeting details held underneath. Role in workflow: what a student's EnrolledSubjects rows link to for room/instructor/time.</w:t>
       </w:r>
     </w:p>
     <w:tbl>
@@ -32026,7 +32001,7 @@
                 <w:sz w:val="18"/>
                 <w:szCs w:val="18"/>
               </w:rPr>
-              <w:t xml:space="preserve">sectionId</w:t>
+              <w:t>blockId</w:t>
             </w:r>
           </w:p>
         </w:tc>
@@ -40349,7 +40324,7 @@
         <w:spacing w:after="140"/>
       </w:pPr>
       <w:r>
-        <w:t>Every foreign key enforces a real constraint the school actually needs: a Payments row can't exist without a real Enrollments row behind it; a ClearanceApprovals row can't exist without a real office and a real clearance case. The six UNIQUE constraints added during validation (one clearance per student per term, one active scholarship per student per term) push business rules the school confirmed as always-true down into the database itself, so a bug or a double-click can't silently create an impossible row. Five performance indexes were also added (idx_students_names on lastName/firstName, idx_payments_or on orNumber, idx_schedules_lookup on sectionId/subjectId, idx_studentscholarships_lookup on studentId/termId, and idx_examresults_student on studentId/courseId/termId) to accelerate the most frequent lookup patterns without premature optimization of every column.</w:t>
+        <w:t>Every foreign key enforces a real constraint the school actually needs: a Payments row can't exist without a real Enrollments row behind it; a ClearanceApprovals row can't exist without a real office and a real clearance case. The six UNIQUE constraints added during validation (one clearance per student per term, one active scholarship per student per term) push business rules the school confirmed as always-true down into the database itself, so a bug or a double-click can't silently create an impossible row. Five performance indexes were also added (idx_students_names on lastName/firstName, idx_payments_or on orNumber, idx_schedules_lookup on blockId/subjectId, idx_studentscholarships_lookup on studentId/termId, and idx_examresults_student on studentId/courseId/termId) to accelerate the most frequent lookup patterns without premature optimization of every column.</w:t>
       </w:r>
     </w:p>
     <w:p>

</xml_diff>

<commit_message>
Align docx Phase 5/6 with confirmed process: Registrar Final (documents, certificates, blocks) at Phase 6, DocumentPrintLog as core print record
</commit_message>
<xml_diff>
--- a/Documentation/EMS Complete Documentation.docx
+++ b/Documentation/EMS Complete Documentation.docx
@@ -2893,7 +2893,7 @@
         <w:spacing w:after="70"/>
       </w:pPr>
       <w:r>
-        <w:t xml:space="preserve">Student receives back the tracking form and the official Enrollment Certificate/Subject Load slip.</w:t>
+        <w:t>Student receives back the tracking form (the Enrollment Certificate and Subject Load slip are issued in Phase 6).</w:t>
       </w:r>
     </w:p>
     <w:p>
@@ -3181,7 +3181,7 @@
         <w:spacing w:after="140" w:before="280"/>
       </w:pPr>
       <w:r>
-        <w:t xml:space="preserve">Phase 6 — Academic Department: Blocking and Scheduling</w:t>
+        <w:t>Phase 6 — Registrar Final: Documents, Certificates, and Blocks</w:t>
       </w:r>
     </w:p>
     <w:p>
@@ -3193,7 +3193,7 @@
           <w:b/>
           <w:bCs/>
         </w:rPr>
-        <w:t>Purpose: Assign the student to a block and finalize their class schedule.</w:t>
+        <w:t>Purpose: Print the Subject Load and Enrollment Certificate, assign the student to a block, and finalize their class schedule.</w:t>
       </w:r>
       <w:r/>
     </w:p>
@@ -3206,11 +3206,9 @@
           <w:b/>
           <w:bCs/>
         </w:rPr>
-        <w:t xml:space="preserve">Who performs it:</w:t>
-      </w:r>
-      <w:r>
-        <w:t xml:space="preserve"> Academic Department staff.</w:t>
-      </w:r>
+        <w:t>Who performs it: Registrar staff (document printing); Academic Department staff (block assignment); the student.</w:t>
+      </w:r>
+      <w:r/>
     </w:p>
     <w:p>
       <w:pPr>
@@ -3231,7 +3229,7 @@
         <w:spacing w:after="70"/>
       </w:pPr>
       <w:r>
-        <w:t xml:space="preserve">None — this phase happens entirely within the school's own systems, without a corresponding student action.</w:t>
+        <w:t>Student receives the printed Subject Load and Enrollment Certificate.</w:t>
       </w:r>
     </w:p>
     <w:p>
@@ -3253,7 +3251,7 @@
         <w:spacing w:after="70"/>
       </w:pPr>
       <w:r>
-        <w:t>Action: assign the student's EnrolledSubjects rows to a Blocks row for their year level/Course/term.</w:t>
+        <w:t>Action: print the Subject Load and Enrollment Certificate, recording a DocumentPrintLog row per print (documentType 'subjectLoad'/'certificate').</w:t>
       </w:r>
     </w:p>
     <w:p>
@@ -3266,7 +3264,7 @@
         <w:spacing w:after="70"/>
       </w:pPr>
       <w:r>
-        <w:t xml:space="preserve">Action: each subject links to a Schedules row (instructor, room), which in turn has one or more ScheduleMeetings rows (since a subject can meet on different days at different times).</w:t>
+        <w:t>Action: assign the student's EnrolledSubjects rows to a Blocks row for their year level/Course/term; each subject links to a Schedules row (instructor, room), which in turn has one or more ScheduleMeetings rows (since a subject can meet on different days at different times).</w:t>
       </w:r>
     </w:p>
     <w:p>
@@ -3652,7 +3650,7 @@
         <w:spacing w:after="140"/>
       </w:pPr>
       <w:r>
-        <w:t>EnrolledSubjects rows (already created in Phase 1, confirmed in Phase 5) are updated here to point at a specific Blocks and Schedules row each — no new EnrolledSubjects rows are created, only linked.</w:t>
+        <w:t>The Subject Load and Enrollment Certificate are printed and logged in DocumentPrintLog; EnrolledSubjects rows (created in Phase 1, confirmed in Phase 5) are updated here to point at a specific Blocks and Schedules row each — no new EnrolledSubjects rows are created, only linked.</w:t>
       </w:r>
     </w:p>
     <w:p>
@@ -38186,7 +38184,7 @@
         <w:spacing w:after="100" w:before="200"/>
       </w:pPr>
       <w:r>
-        <w:t xml:space="preserve">DocumentPrintLog  (OPTIONAL)</w:t>
+        <w:t>DocumentPrintLog</w:t>
       </w:r>
     </w:p>
     <w:p>
@@ -38194,7 +38192,7 @@
         <w:spacing w:after="140"/>
       </w:pPr>
       <w:r>
-        <w:t xml:space="preserve">Tracks reprints of certificates/subject cards for verification/anti-fraud purposes. Optional — only worth it if reprint fraud has been a real problem.</w:t>
+        <w:t>Tracks every print of the Subject Load and Enrollment Certificate (documentType: subjectLoad, classCard, certificate) — the digital record of the documents handed to the student in Phase 6.</w:t>
       </w:r>
     </w:p>
     <w:tbl>

</xml_diff>

<commit_message>
Move Mid-Course Qualifying Exam out of the numbered enrollment flow: post-enrollment section (Phases 0-8 only)
</commit_message>
<xml_diff>
--- a/Documentation/EMS Complete Documentation.docx
+++ b/Documentation/EMS Complete Documentation.docx
@@ -4264,7 +4264,7 @@
         <w:spacing w:after="140" w:before="280"/>
       </w:pPr>
       <w:r>
-        <w:t>Phase 9 — Mid-Course Qualifying Exam (Conditional)</w:t>
+        <w:t>Post-Enrollment — Mid-Course Qualifying Exam (Conditional, Not Part of the Enrollment Flow)</w:t>
       </w:r>
     </w:p>
     <w:p>
@@ -4276,11 +4276,9 @@
           <w:b/>
           <w:bCs/>
         </w:rPr>
-        <w:t xml:space="preserve">Purpose:</w:t>
-      </w:r>
-      <w:r>
-        <w:t xml:space="preserve"> Gate advancement to a later year level for Courses that require it.</w:t>
-      </w:r>
+        <w:t>Purpose: Gate advancement to a later year level for Courses that require it. This is a post-enrollment exam (mid-semester, after enrollment is complete) — it is NOT one of the enrollment flow phases (0–8) and has no step on the Enrollment Workflow Process form.</w:t>
+      </w:r>
+      <w:r/>
     </w:p>
     <w:p>
       <w:pPr>
@@ -4316,7 +4314,7 @@
         <w:spacing w:after="70"/>
       </w:pPr>
       <w:r>
-        <w:t>Student takes the mid-course qualifying exam before advancing to the relevant year level. (The retention exam is not part of this phase — continuing board-course students take it in Phase 1, before the enrollment form.)</w:t>
+        <w:t>Student takes the mid-course qualifying exam mid-semester, after being enrolled, before advancing to the relevant year level. (The retention exam is not part of this phase — continuing board-course students take it in Phase 1, before the enrollment form.)</w:t>
       </w:r>
     </w:p>
     <w:p>
@@ -4518,7 +4516,7 @@
         <w:spacing w:after="140"/>
       </w:pPr>
       <w:r>
-        <w:t>Structurally identical to Phase 0.5's entrance exam — same table, different examStage value, distinguishing the two without needing two different tables (entrance exams additionally use examType to separate the Guidance general exam from the department course-specific exam).</w:t>
+        <w:t>Structurally identical to Phase 0.5's entrance exam — same table, different examStage value, distinguishing the two without needing two different tables (entrance exams additionally use examType to separate the Guidance general exam from the department course-specific exam). It is positioned after the flow rather than numbered as Phase 9 because it happens mid-semester, after the enrollment walk (Phases 0–8) is complete.</w:t>
       </w:r>
     </w:p>
     <w:p>

</xml_diff>

<commit_message>
Remove Mid-Course Qualifying Exam (duplicate of Retention): examStage enum to entrance/retention, requiresQualifyingExam -> requiresRetentionExam, delete qualifying sections from all docs
</commit_message>
<xml_diff>
--- a/Documentation/EMS Complete Documentation.docx
+++ b/Documentation/EMS Complete Documentation.docx
@@ -4258,109 +4258,6 @@
         <w:t xml:space="preserve">A shifter or lost-card case simply produces a new IdRequests/StudentIds pair (requestReason='shifted'/'lost') referencing their current Enrollments row — the old StudentIds row isn't deleted, it just stops being the current one.</w:t>
       </w:r>
     </w:p>
-    <w:p>
-      <w:pPr>
-        <w:pStyle w:val="Heading2"/>
-        <w:spacing w:after="140" w:before="280"/>
-      </w:pPr>
-      <w:r>
-        <w:t>Post-Enrollment — Mid-Course Qualifying Exam (Conditional, Not Part of the Enrollment Flow)</w:t>
-      </w:r>
-    </w:p>
-    <w:p>
-      <w:pPr>
-        <w:spacing w:after="140"/>
-      </w:pPr>
-      <w:r>
-        <w:rPr>
-          <w:b/>
-          <w:bCs/>
-        </w:rPr>
-        <w:t>Purpose: Gate advancement to a later year level for Courses that require it. This is a post-enrollment exam (mid-semester, after enrollment is complete) — it is NOT one of the enrollment flow phases (0–8) and has no step on the Enrollment Workflow Process form.</w:t>
-      </w:r>
-      <w:r/>
-    </w:p>
-    <w:p>
-      <w:pPr>
-        <w:spacing w:after="140"/>
-      </w:pPr>
-      <w:r>
-        <w:rPr>
-          <w:b/>
-          <w:bCs/>
-        </w:rPr>
-        <w:t xml:space="preserve">Who performs it:</w:t>
-      </w:r>
-      <w:r>
-        <w:t xml:space="preserve"> Whichever office administers the exam; the student.</w:t>
-      </w:r>
-    </w:p>
-    <w:p>
-      <w:pPr>
-        <w:pStyle w:val="Heading3"/>
-        <w:spacing w:after="100" w:before="200"/>
-      </w:pPr>
-      <w:r>
-        <w:t xml:space="preserve">External (Applicant / Student / Third Party)</w:t>
-      </w:r>
-    </w:p>
-    <w:p>
-      <w:pPr>
-        <w:pStyle w:val="ListParagraph"/>
-        <w:numPr>
-          <w:ilvl w:val="0"/>
-          <w:numId w:val="1"/>
-        </w:numPr>
-        <w:spacing w:after="70"/>
-      </w:pPr>
-      <w:r>
-        <w:t>Student takes the mid-course qualifying exam mid-semester, after being enrolled, before advancing to the relevant year level. (The retention exam is not part of this phase — continuing board-course students take it in Phase 1, before the enrollment form.)</w:t>
-      </w:r>
-    </w:p>
-    <w:p>
-      <w:pPr>
-        <w:pStyle w:val="Heading3"/>
-        <w:spacing w:after="100" w:before="200"/>
-      </w:pPr>
-      <w:r>
-        <w:t xml:space="preserve">Internal (Staff, Office, and System Actions/Decisions)</w:t>
-      </w:r>
-    </w:p>
-    <w:p>
-      <w:pPr>
-        <w:pStyle w:val="ListParagraph"/>
-        <w:numPr>
-          <w:ilvl w:val="0"/>
-          <w:numId w:val="1"/>
-        </w:numPr>
-        <w:spacing w:after="70"/>
-      </w:pPr>
-      <w:r>
-        <w:t>Action: record the result as an ExamResults row, tagged examStage='midCourseQualifying'.</w:t>
-      </w:r>
-    </w:p>
-    <w:p>
-      <w:pPr>
-        <w:pStyle w:val="ListParagraph"/>
-        <w:numPr>
-          <w:ilvl w:val="0"/>
-          <w:numId w:val="1"/>
-        </w:numPr>
-        <w:spacing w:after="70"/>
-      </w:pPr>
-      <w:r>
-        <w:t xml:space="preserve">Decision: a failed result can be checked before a future Enrollments row for the next year level is allowed to proceed.</w:t>
-      </w:r>
-    </w:p>
-    <w:p>
-      <w:pPr>
-        <w:pStyle w:val="Heading3"/>
-        <w:spacing w:after="100" w:before="200"/>
-      </w:pPr>
-      <w:r>
-        <w:t xml:space="preserve">Tables and Key Attributes Involved</w:t>
-      </w:r>
-    </w:p>
     <w:tbl>
       <w:tblPr>
         <w:tblW w:type="dxa" w:w="9360"/>
@@ -4442,83 +4339,6 @@
         </w:tc>
       </w:tr>
     </w:tbl>
-    <w:p>
-      <w:pPr>
-        <w:spacing w:after="140"/>
-      </w:pPr>
-      <w:r>
-        <w:rPr>
-          <w:sz w:val="2"/>
-          <w:szCs w:val="2"/>
-        </w:rPr>
-        <w:t xml:space="preserve"/>
-      </w:r>
-    </w:p>
-    <w:p>
-      <w:pPr>
-        <w:pStyle w:val="Heading3"/>
-        <w:spacing w:after="100" w:before="200"/>
-      </w:pPr>
-      <w:r>
-        <w:t xml:space="preserve">Relationships and Cardinality Active in This Phase</w:t>
-      </w:r>
-    </w:p>
-    <w:p>
-      <w:pPr>
-        <w:pStyle w:val="ListParagraph"/>
-        <w:numPr>
-          <w:ilvl w:val="0"/>
-          <w:numId w:val="1"/>
-        </w:numPr>
-        <w:spacing w:after="70"/>
-      </w:pPr>
-      <w:r>
-        <w:t>Students → ExamResults.studentId (1:M, mandatory)</w:t>
-      </w:r>
-    </w:p>
-    <w:p>
-      <w:pPr>
-        <w:pStyle w:val="ListParagraph"/>
-        <w:numPr>
-          <w:ilvl w:val="0"/>
-          <w:numId w:val="1"/>
-        </w:numPr>
-        <w:spacing w:after="70"/>
-      </w:pPr>
-      <w:r>
-        <w:t>Courses → ExamResults.courseId (1:M, mandatory)</w:t>
-      </w:r>
-    </w:p>
-    <w:p>
-      <w:pPr>
-        <w:pStyle w:val="ListParagraph"/>
-        <w:numPr>
-          <w:ilvl w:val="0"/>
-          <w:numId w:val="1"/>
-        </w:numPr>
-        <w:spacing w:after="70"/>
-      </w:pPr>
-      <w:r>
-        <w:t>AcademicTerms → ExamResults.termId (1:M, mandatory)</w:t>
-      </w:r>
-    </w:p>
-    <w:p>
-      <w:pPr>
-        <w:pStyle w:val="Heading3"/>
-        <w:spacing w:after="100" w:before="200"/>
-      </w:pPr>
-      <w:r>
-        <w:t xml:space="preserve">Data Flow</w:t>
-      </w:r>
-    </w:p>
-    <w:p>
-      <w:pPr>
-        <w:spacing w:after="140"/>
-      </w:pPr>
-      <w:r>
-        <w:t>Structurally identical to Phase 0.5's entrance exam — same table, different examStage value, distinguishing the two without needing two different tables (entrance exams additionally use examType to separate the Guidance general exam from the department course-specific exam). It is positioned after the flow rather than numbered as Phase 9 because it happens mid-semester, after the enrollment walk (Phases 0–8) is complete.</w:t>
-      </w:r>
-    </w:p>
     <w:p>
       <w:pPr>
         <w:pStyle w:val="Heading2"/>
@@ -11468,7 +11288,7 @@
         <w:spacing w:after="140"/>
       </w:pPr>
       <w:r>
-        <w:t xml:space="preserve">One row per degree program — named "Course" to match the school's own terminology. Carries independent flags for whether an entrance exam and/or mid-course qualifying exam is required. Role in workflow: the anchor for curriculum, sections, and every enrollment.</w:t>
+        <w:t>One row per degree program — named "Course" to match the school's own terminology. Carries independent flags for whether an entrance exam and/or retention exam is required. Role in workflow: the anchor for curriculum, sections, and every enrollment.</w:t>
       </w:r>
     </w:p>
     <w:tbl>
@@ -12092,7 +11912,7 @@
                 <w:sz w:val="18"/>
                 <w:szCs w:val="18"/>
               </w:rPr>
-              <w:t xml:space="preserve">requiresQualifyingExam</w:t>
+              <w:t>requiresRetentionExam</w:t>
             </w:r>
           </w:p>
         </w:tc>
@@ -15361,7 +15181,7 @@
         <w:spacing w:after="140"/>
       </w:pPr>
       <w:r>
-        <w:t xml:space="preserve">Records of entrance and mid-course qualifying exam results, for the Courses that require either. Role in workflow: an entrance exam result can gate Admission; a qualifying exam result can gate advancement to a later year level.</w:t>
+        <w:t>Records of entrance and retention exam results, for the Courses that require either. Role in workflow: an entrance exam result can gate Admission; a retention exam result gates the enrollment form for continuing board-course students.</w:t>
       </w:r>
     </w:p>
     <w:tbl>

</xml_diff>

<commit_message>
Final reconciliation: docx Phase 8 validation by ID Office (was Safety and Security), process paths table corrected (retention exam for continuing, Phase 8 in all paths), report verdict 9+9
</commit_message>
<xml_diff>
--- a/Documentation/EMS Complete Documentation.docx
+++ b/Documentation/EMS Complete Documentation.docx
@@ -3912,11 +3912,9 @@
           <w:b/>
           <w:bCs/>
         </w:rPr>
-        <w:t xml:space="preserve">Who performs it:</w:t>
-      </w:r>
-      <w:r>
-        <w:t xml:space="preserve"> JZEL Printing Services (external vendor, card production); Safety and Security (internal, validation and tracking-form signature).</w:t>
-      </w:r>
+        <w:t>Who performs it: JZEL Printing Services (external vendor, card production); ID Office (internal, validation and tracking-form signature).</w:t>
+      </w:r>
+      <w:r/>
     </w:p>
     <w:p>
       <w:pPr>
@@ -3950,7 +3948,7 @@
         <w:spacing w:after="70"/>
       </w:pPr>
       <w:r>
-        <w:t xml:space="preserve">Student proceeds to Safety and Security, is photographed again (a separate, security-specific photo), and the card is validated.</w:t>
+        <w:t>Student proceeds to the ID Office, is photographed again (a separate, ID-specific photo), and the card is validated.</w:t>
       </w:r>
     </w:p>
     <w:p>
@@ -3998,7 +3996,7 @@
         <w:spacing w:after="70"/>
       </w:pPr>
       <w:r>
-        <w:t xml:space="preserve">Action: Safety and Security updates that same StudentIds row — securityPhotoPath, validatedBy, validatedDate, validationStatus → 'active'.</w:t>
+        <w:t>Action: ID Office updates that same StudentIds row — securityPhotoPath, validatedBy, validatedDate, validationStatus → 'active'.</w:t>
       </w:r>
     </w:p>
     <w:p>
@@ -4011,7 +4009,7 @@
         <w:spacing w:after="70"/>
       </w:pPr>
       <w:r>
-        <w:t xml:space="preserve">Action: the final WorkflowSteps row is recorded for Safety and Security only (JZEL has no signing role); EnrollmentWorkflow.workflowStatus is set to 'completed'.</w:t>
+        <w:t>Action: the final WorkflowSteps row is recorded for the ID Office only (JZEL has no signing role); EnrollmentWorkflow.workflowStatus is set to 'completed'.</w:t>
       </w:r>
     </w:p>
     <w:p>
@@ -4570,7 +4568,7 @@
                 <w:sz w:val="18"/>
                 <w:szCs w:val="18"/>
               </w:rPr>
-              <w:t xml:space="preserve">0 → 0.5(if applicable) → 1 → 3 → 4 → 5 → 6 → 7 → 8(if applicable)</w:t>
+              <w:t>0 → 0.5(if applicable) → 1 → 3 → 4 → 5 → 6 → 7 → 8</w:t>
             </w:r>
           </w:p>
         </w:tc>
@@ -4665,7 +4663,7 @@
                 <w:sz w:val="18"/>
                 <w:szCs w:val="18"/>
               </w:rPr>
-              <w:t xml:space="preserve">1 → 2 → 3 → 4 → 5 → 6 → 7 → 8(if applicable)</w:t>
+              <w:t>1 → 2 → 3 → 4 → 5 → 6 → 7 → 8(if applicable)</w:t>
             </w:r>
           </w:p>
         </w:tc>
@@ -4696,7 +4694,7 @@
                 <w:sz w:val="18"/>
                 <w:szCs w:val="18"/>
               </w:rPr>
-              <w:t xml:space="preserve">Skips Admission and any exam phases; must clear Phase 2 before Phase 1 can complete.</w:t>
+              <w:t>Skips Admission and the entrance exam; board-course continuing students take the Retention Exam before Phase 1; must clear Phase 2 before Phase 1 can complete.</w:t>
             </w:r>
           </w:p>
         </w:tc>
@@ -4760,7 +4758,7 @@
                 <w:sz w:val="18"/>
                 <w:szCs w:val="18"/>
               </w:rPr>
-              <w:t xml:space="preserve">1 → 2 → 3 → 4 → 5 → 6 → 7</w:t>
+              <w:t>1 → 2 → 3 → 4 → 5 → 6 → 7 → 8(if applicable)</w:t>
             </w:r>
           </w:p>
         </w:tc>
@@ -4855,7 +4853,7 @@
                 <w:sz w:val="18"/>
                 <w:szCs w:val="18"/>
               </w:rPr>
-              <w:t xml:space="preserve">0 → 1 → 3 → 4 → 5 → 6 → 7</w:t>
+              <w:t>0 → 1 → 3 → 4 → 5 → 6 → 7 → 8</w:t>
             </w:r>
           </w:p>
         </w:tc>
@@ -4950,7 +4948,7 @@
                 <w:sz w:val="18"/>
                 <w:szCs w:val="18"/>
               </w:rPr>
-              <w:t xml:space="preserve">1 → 2 → 3 → 4 → 5 → 6 → 7</w:t>
+              <w:t>1 → 2 → 3 → 4 → 5 → 6 → 7 → 8(if applicable)</w:t>
             </w:r>
           </w:p>
         </w:tc>
@@ -33382,7 +33380,7 @@
           <w:iCs/>
           <w:color w:val="555555"/>
         </w:rPr>
-        <w:t xml:space="preserve">Card production (external, via JZEL) and validation (internal, Safety and Security).</w:t>
+        <w:t>Card production (external, via JZEL) and validation (internal, ID Office).</w:t>
       </w:r>
     </w:p>
     <w:p>
@@ -34512,7 +34510,7 @@
         <w:spacing w:after="140"/>
       </w:pPr>
       <w:r>
-        <w:t xml:space="preserve">The card as a system record — QR value and validation state, starting "pendingValidation" until Safety and Security processes it. Role in workflow: what makes the card actually usable.</w:t>
+        <w:t>The card as a system record — QR value and validation state, starting "pendingValidation" until the ID Office processes it. Role in workflow: what makes the card actually usable.</w:t>
       </w:r>
     </w:p>
     <w:tbl>

</xml_diff>

<commit_message>
docs: split Registrar and Blocking and Scheduling into separate phases
- Phase 5 Registrar Approval now issues Subject Load + Enrollment
  Certificate (documentprintlog)
- Phase 6 retitled to Academic Department: Blocking and Scheduling
  (block assignment only, after the Registrar)
- Dialogue: block/schedule pointers filled in Phase 6 (UPDATE
  enrolledsubjects), workflow step 5 = Registrar, step 6 = blocking
- RepMD: phase map, data flow, BR13/BR14 span updated to 5-8
- Fix dialogue Phase 4 Accounting workflow signature officeId 3 -> 2
</commit_message>
<xml_diff>
--- a/Documentation/EMS Complete Documentation.docx
+++ b/Documentation/EMS Complete Documentation.docx
@@ -2893,7 +2893,7 @@
         <w:spacing w:after="70"/>
       </w:pPr>
       <w:r>
-        <w:t>Student receives back the tracking form (the Enrollment Certificate and Subject Load slip are issued in Phase 6).</w:t>
+        <w:t>Student receives back the tracking form along with the printed Subject Load and Enrollment Certificate.</w:t>
       </w:r>
     </w:p>
     <w:p>
@@ -2955,6 +2955,19 @@
       </w:pPr>
       <w:r>
         <w:t xml:space="preserve">Action: record a WorkflowSteps row for Registrar.</w:t>
+      </w:r>
+    </w:p>
+    <w:p>
+      <w:pPr>
+        <w:pStyle w:val="ListParagraph"/>
+        <w:numPr>
+          <w:ilvl w:val="0"/>
+          <w:numId w:val="1"/>
+        </w:numPr>
+        <w:spacing w:after="70"/>
+      </w:pPr>
+      <w:r>
+        <w:t>Action: print the Subject Load and Enrollment Certificate, recording a DocumentPrintLog row per print (documentType 'subjectLoad'/'certificate').</w:t>
       </w:r>
     </w:p>
     <w:p>
@@ -3160,67 +3173,6 @@
     </w:p>
     <w:p>
       <w:pPr>
-        <w:pStyle w:val="Heading3"/>
-        <w:spacing w:after="100" w:before="200"/>
-      </w:pPr>
-      <w:r>
-        <w:t xml:space="preserve">Data Flow</w:t>
-      </w:r>
-    </w:p>
-    <w:p>
-      <w:pPr>
-        <w:spacing w:after="140"/>
-      </w:pPr>
-      <w:r>
-        <w:t xml:space="preserve">No new tables are created here — this phase is almost entirely status transitions on rows already created in Phases 1 and 4, which is why it can be a single verification step rather than its own data-entry-heavy stage.</w:t>
-      </w:r>
-    </w:p>
-    <w:p>
-      <w:pPr>
-        <w:pStyle w:val="Heading2"/>
-        <w:spacing w:after="140" w:before="280"/>
-      </w:pPr>
-      <w:r>
-        <w:t>Phase 6 — Registrar Final: Documents, Certificates, and Blocks</w:t>
-      </w:r>
-    </w:p>
-    <w:p>
-      <w:pPr>
-        <w:spacing w:after="140"/>
-      </w:pPr>
-      <w:r>
-        <w:rPr>
-          <w:b/>
-          <w:bCs/>
-        </w:rPr>
-        <w:t>Purpose: Print the Subject Load and Enrollment Certificate, assign the student to a block, and finalize their class schedule.</w:t>
-      </w:r>
-      <w:r/>
-    </w:p>
-    <w:p>
-      <w:pPr>
-        <w:spacing w:after="140"/>
-      </w:pPr>
-      <w:r>
-        <w:rPr>
-          <w:b/>
-          <w:bCs/>
-        </w:rPr>
-        <w:t>Who performs it: Registrar staff (document printing); Academic Department staff (block assignment); the student.</w:t>
-      </w:r>
-      <w:r/>
-    </w:p>
-    <w:p>
-      <w:pPr>
-        <w:pStyle w:val="Heading3"/>
-        <w:spacing w:after="100" w:before="200"/>
-      </w:pPr>
-      <w:r>
-        <w:t xml:space="preserve">External (Applicant / Student / Third Party)</w:t>
-      </w:r>
-    </w:p>
-    <w:p>
-      <w:pPr>
         <w:pStyle w:val="ListParagraph"/>
         <w:numPr>
           <w:ilvl w:val="0"/>
@@ -3229,16 +3181,7 @@
         <w:spacing w:after="70"/>
       </w:pPr>
       <w:r>
-        <w:t>Student receives the printed Subject Load and Enrollment Certificate.</w:t>
-      </w:r>
-    </w:p>
-    <w:p>
-      <w:pPr>
-        <w:pStyle w:val="Heading3"/>
-        <w:spacing w:after="100" w:before="200"/>
-      </w:pPr>
-      <w:r>
-        <w:t xml:space="preserve">Internal (Staff, Office, and System Actions/Decisions)</w:t>
+        <w:t>StaffUsers → WorkflowSteps.signedBy (1:M, nullable)</w:t>
       </w:r>
     </w:p>
     <w:p>
@@ -3251,7 +3194,7 @@
         <w:spacing w:after="70"/>
       </w:pPr>
       <w:r>
-        <w:t>Action: print the Subject Load and Enrollment Certificate, recording a DocumentPrintLog row per print (documentType 'subjectLoad'/'certificate').</w:t>
+        <w:t>Offices → WorkflowSteps.officeId (1:M, mandatory — Registrar is officeId=1)</w:t>
       </w:r>
     </w:p>
     <w:p>
@@ -3264,7 +3207,7 @@
         <w:spacing w:after="70"/>
       </w:pPr>
       <w:r>
-        <w:t>Action: assign the student's EnrolledSubjects rows to a Blocks row for their year level/Course/term; each subject links to a Schedules row (instructor, room), which in turn has one or more ScheduleMeetings rows (since a subject can meet on different days at different times).</w:t>
+        <w:t>EnrollmentWorkflow → WorkflowSteps.workflowId (1:M, mandatory)</w:t>
       </w:r>
     </w:p>
     <w:p>
@@ -3277,7 +3220,114 @@
         <w:spacing w:after="70"/>
       </w:pPr>
       <w:r>
-        <w:t xml:space="preserve">Action: record a second WorkflowSteps row for the Academic Department (this time for blocking).</w:t>
+        <w:t>Enrollments → DocumentPrintLog.enrollmentId (1:M, mandatory — one row per document print)</w:t>
+      </w:r>
+    </w:p>
+    <w:p>
+      <w:pPr>
+        <w:pStyle w:val="Heading3"/>
+        <w:spacing w:after="100" w:before="200"/>
+      </w:pPr>
+      <w:r>
+        <w:t xml:space="preserve">Data Flow</w:t>
+      </w:r>
+    </w:p>
+    <w:p>
+      <w:pPr>
+        <w:spacing w:after="140"/>
+      </w:pPr>
+      <w:r>
+        <w:t>This phase is almost entirely status transitions on rows already created in Phases 1 and 4, plus the document prints recorded in DocumentPrintLog — which is why it can be a single verification step rather than its own data-entry-heavy stage.</w:t>
+      </w:r>
+    </w:p>
+    <w:p>
+      <w:pPr>
+        <w:pStyle w:val="Heading2"/>
+        <w:spacing w:after="140" w:before="280"/>
+      </w:pPr>
+      <w:r>
+        <w:t>Phase 6 — Academic Department: Blocking and Scheduling</w:t>
+      </w:r>
+    </w:p>
+    <w:p>
+      <w:pPr>
+        <w:spacing w:after="140"/>
+      </w:pPr>
+      <w:r>
+        <w:rPr>
+          <w:b/>
+          <w:bCs/>
+        </w:rPr>
+        <w:t>Purpose: Assign the student to a block — a fixed group of students for their year level, course, and term — and finalize their class schedule.</w:t>
+      </w:r>
+    </w:p>
+    <w:p>
+      <w:pPr>
+        <w:spacing w:after="140"/>
+      </w:pPr>
+      <w:r>
+        <w:rPr>
+          <w:b/>
+          <w:bCs/>
+        </w:rPr>
+        <w:t>Who performs it: Academic Department staff; the student.</w:t>
+      </w:r>
+    </w:p>
+    <w:p>
+      <w:pPr>
+        <w:pStyle w:val="Heading3"/>
+        <w:spacing w:after="100" w:before="200"/>
+      </w:pPr>
+      <w:r>
+        <w:t xml:space="preserve">External (Applicant / Student / Third Party)</w:t>
+      </w:r>
+    </w:p>
+    <w:p>
+      <w:pPr>
+        <w:pStyle w:val="ListParagraph"/>
+        <w:numPr>
+          <w:ilvl w:val="0"/>
+          <w:numId w:val="1"/>
+        </w:numPr>
+        <w:spacing w:after="70"/>
+      </w:pPr>
+      <w:r>
+        <w:t>Student is informed of their assigned block, class schedule, instructors, and rooms.</w:t>
+      </w:r>
+    </w:p>
+    <w:p>
+      <w:pPr>
+        <w:pStyle w:val="Heading3"/>
+        <w:spacing w:after="100" w:before="200"/>
+      </w:pPr>
+      <w:r>
+        <w:t xml:space="preserve">Internal (Staff, Office, and System Actions/Decisions)</w:t>
+      </w:r>
+    </w:p>
+    <w:p>
+      <w:pPr>
+        <w:pStyle w:val="ListParagraph"/>
+        <w:numPr>
+          <w:ilvl w:val="0"/>
+          <w:numId w:val="1"/>
+        </w:numPr>
+        <w:spacing w:after="70"/>
+      </w:pPr>
+      <w:r>
+        <w:t>Action: assign the student's EnrolledSubjects rows to a Blocks row for their year level/Course/term; each subject links to a Schedules row (instructor, room), which in turn has one or more ScheduleMeetings rows (since a subject can meet on different days at different times).</w:t>
+      </w:r>
+    </w:p>
+    <w:p>
+      <w:pPr>
+        <w:pStyle w:val="ListParagraph"/>
+        <w:numPr>
+          <w:ilvl w:val="0"/>
+          <w:numId w:val="1"/>
+        </w:numPr>
+        <w:spacing w:after="70"/>
+      </w:pPr>
+      <w:r>
+        <w:t>Action: record a WorkflowSteps row for the Academic Department (blocking).</w:t>
       </w:r>
     </w:p>
     <w:p>
@@ -3650,7 +3700,7 @@
         <w:spacing w:after="140"/>
       </w:pPr>
       <w:r>
-        <w:t>The Subject Load and Enrollment Certificate are printed and logged in DocumentPrintLog; EnrolledSubjects rows (created in Phase 1, confirmed in Phase 5) are updated here to point at a specific Blocks and Schedules row each — no new EnrolledSubjects rows are created, only linked.</w:t>
+        <w:t>EnrolledSubjects rows (created in Phase 1, confirmed in Phase 5) are updated here to point at a specific Blocks and Schedules row each; the block gives the student a fixed schedule of subjects, instructors, and rooms.</w:t>
       </w:r>
     </w:p>
     <w:p>

</xml_diff>

<commit_message>
Align schema, docs, and SQL dump with print forms (clearance slip, enrollment form, enrollment certificate, class card, block/schedule)
</commit_message>
<xml_diff>
--- a/Documentation/EMS Complete Documentation.docx
+++ b/Documentation/EMS Complete Documentation.docx
@@ -60,7 +60,7 @@
           <w:sz w:val="20"/>
           <w:szCs w:val="20"/>
         </w:rPr>
-        <w:t>46 tables, 78 foreign-key constraints — validated schema</w:t>
+        <w:t>46 tables, 79 foreign-key constraints — validated schema</w:t>
       </w:r>
     </w:p>
     <w:p>
@@ -1081,174 +1081,6 @@
         <w:t>This step only produces data for Courses with requiresEntranceExam=true (board courses); for every other Course this phase is skipped entirely. Board-course applicants produce two ExamResults rows (general + courseSpecific), both under examStage='entrance'.</w:t>
       </w:r>
     </w:p>
-    <w:p>
-      <w:pPr>
-        <w:pStyle w:val="Heading2"/>
-        <w:spacing w:after="140" w:before="280"/>
-      </w:pPr>
-      <w:r>
-        <w:t xml:space="preserve">Phase 1 — Academic Department Evaluation</w:t>
-      </w:r>
-    </w:p>
-    <w:p>
-      <w:pPr>
-        <w:spacing w:after="140"/>
-      </w:pPr>
-      <w:r>
-        <w:rPr>
-          <w:b/>
-          <w:bCs/>
-        </w:rPr>
-        <w:t>Purpose: Issue the enrollment form, confirm the student's Course/Major, evaluate prior standing, and set the term's subject load.</w:t>
-      </w:r>
-      <w:r/>
-    </w:p>
-    <w:p>
-      <w:pPr>
-        <w:spacing w:after="140"/>
-      </w:pPr>
-      <w:r>
-        <w:rPr>
-          <w:b/>
-          <w:bCs/>
-        </w:rPr>
-        <w:t xml:space="preserve">Who performs it:</w:t>
-      </w:r>
-      <w:r>
-        <w:t xml:space="preserve"> Academic Department staff (evaluator); the student (presenting clearance/prior records as applicable).</w:t>
-      </w:r>
-    </w:p>
-    <w:p>
-      <w:pPr>
-        <w:pStyle w:val="Heading3"/>
-        <w:spacing w:after="100" w:before="200"/>
-      </w:pPr>
-      <w:r>
-        <w:t xml:space="preserve">External (Applicant / Student / Third Party)</w:t>
-      </w:r>
-    </w:p>
-    <w:p>
-      <w:pPr>
-        <w:pStyle w:val="ListParagraph"/>
-        <w:numPr>
-          <w:ilvl w:val="0"/>
-          <w:numId w:val="1"/>
-        </w:numPr>
-        <w:spacing w:after="70"/>
-      </w:pPr>
-      <w:r>
-        <w:t>Student lines up, receives the enrollment form, and fills in the required personal and term information.</w:t>
-      </w:r>
-    </w:p>
-    <w:p>
-      <w:pPr>
-        <w:pStyle w:val="ListParagraph"/>
-        <w:numPr>
-          <w:ilvl w:val="0"/>
-          <w:numId w:val="1"/>
-        </w:numPr>
-        <w:spacing w:after="70"/>
-      </w:pPr>
-      <w:r>
-        <w:t>Board-course continuing students (2nd–5th year) first take the retention exam (see the Decision below) before the enrollment form is issued and evaluated.</w:t>
-      </w:r>
-    </w:p>
-    <w:p>
-      <w:pPr>
-        <w:pStyle w:val="ListParagraph"/>
-        <w:numPr>
-          <w:ilvl w:val="0"/>
-          <w:numId w:val="1"/>
-        </w:numPr>
-        <w:spacing w:after="70"/>
-      </w:pPr>
-      <w:r>
-        <w:t>Transferee/shifter: bring prior academic records for crediting. Some colleges may also ask for the prior term's clearance here (optional at this phase; it becomes mandatory at the Registrar, see Phase 5).</w:t>
-      </w:r>
-    </w:p>
-    <w:p>
-      <w:pPr>
-        <w:pStyle w:val="Heading3"/>
-        <w:spacing w:after="100" w:before="200"/>
-      </w:pPr>
-      <w:r>
-        <w:t xml:space="preserve">Internal (Staff, Office, and System Actions/Decisions)</w:t>
-      </w:r>
-    </w:p>
-    <w:p>
-      <w:pPr>
-        <w:pStyle w:val="ListParagraph"/>
-        <w:numPr>
-          <w:ilvl w:val="0"/>
-          <w:numId w:val="1"/>
-        </w:numPr>
-        <w:spacing w:after="70"/>
-      </w:pPr>
-      <w:r>
-        <w:t>Decision: for continuing/irregular students in board courses, check the retention exam result (ExamResults with examStage='retention') first — a failed result blocks the enrollment form. Then evaluate the prior term's EnrolledSubjects.grade values against GradeScale to determine passing/failing, setting the new Enrollments.academicStanding to 'regular' or 'irregular'.</w:t>
-      </w:r>
-    </w:p>
-    <w:p>
-      <w:pPr>
-        <w:pStyle w:val="ListParagraph"/>
-        <w:numPr>
-          <w:ilvl w:val="0"/>
-          <w:numId w:val="1"/>
-        </w:numPr>
-        <w:spacing w:after="70"/>
-      </w:pPr>
-      <w:r>
-        <w:t xml:space="preserve">Decision: for transferees/shifters, evaluate TransferAcademicRecords rows and determine which are credited, creating CreditedSubjects rows.</w:t>
-      </w:r>
-    </w:p>
-    <w:p>
-      <w:pPr>
-        <w:pStyle w:val="ListParagraph"/>
-        <w:numPr>
-          <w:ilvl w:val="0"/>
-          <w:numId w:val="1"/>
-        </w:numPr>
-        <w:spacing w:after="70"/>
-      </w:pPr>
-      <w:r>
-        <w:t xml:space="preserve">Action: create the Enrollments row for this term — Student, Course, Major (if any), term, studentType, academicStanding, and the originating Admissions row where applicable.</w:t>
-      </w:r>
-    </w:p>
-    <w:p>
-      <w:pPr>
-        <w:pStyle w:val="ListParagraph"/>
-        <w:numPr>
-          <w:ilvl w:val="0"/>
-          <w:numId w:val="1"/>
-        </w:numPr>
-        <w:spacing w:after="70"/>
-      </w:pPr>
-      <w:r>
-        <w:t>Action: record the evaluator on Enrollments.evaluatedBy; the evaluator signs the enrollment form with the subject load.</w:t>
-      </w:r>
-    </w:p>
-    <w:p>
-      <w:pPr>
-        <w:pStyle w:val="ListParagraph"/>
-        <w:numPr>
-          <w:ilvl w:val="0"/>
-          <w:numId w:val="1"/>
-        </w:numPr>
-        <w:spacing w:after="70"/>
-      </w:pPr>
-      <w:r>
-        <w:t xml:space="preserve">Action: record a WorkflowSteps row for this office.</w:t>
-      </w:r>
-    </w:p>
-    <w:p>
-      <w:pPr>
-        <w:pStyle w:val="Heading3"/>
-        <w:spacing w:after="100" w:before="200"/>
-      </w:pPr>
-      <w:r>
-        <w:t xml:space="preserve">Tables and Key Attributes Involved</w:t>
-      </w:r>
-    </w:p>
     <w:tbl>
       <w:tblPr>
         <w:tblW w:type="dxa" w:w="9360"/>
@@ -1458,305 +1290,6 @@
         </w:tc>
       </w:tr>
     </w:tbl>
-    <w:p>
-      <w:pPr>
-        <w:spacing w:after="140"/>
-      </w:pPr>
-      <w:r>
-        <w:rPr>
-          <w:sz w:val="2"/>
-          <w:szCs w:val="2"/>
-        </w:rPr>
-        <w:t xml:space="preserve"/>
-      </w:r>
-    </w:p>
-    <w:p>
-      <w:pPr>
-        <w:pStyle w:val="Heading3"/>
-        <w:spacing w:after="100" w:before="200"/>
-      </w:pPr>
-      <w:r>
-        <w:t xml:space="preserve">Relationships and Cardinality Active in This Phase</w:t>
-      </w:r>
-    </w:p>
-    <w:p>
-      <w:pPr>
-        <w:pStyle w:val="ListParagraph"/>
-        <w:numPr>
-          <w:ilvl w:val="0"/>
-          <w:numId w:val="1"/>
-        </w:numPr>
-        <w:spacing w:after="70"/>
-      </w:pPr>
-      <w:r>
-        <w:t xml:space="preserve">Students → Enrollments.studentId (1:M, mandatory)</w:t>
-      </w:r>
-    </w:p>
-    <w:p>
-      <w:pPr>
-        <w:pStyle w:val="ListParagraph"/>
-        <w:numPr>
-          <w:ilvl w:val="0"/>
-          <w:numId w:val="1"/>
-        </w:numPr>
-        <w:spacing w:after="70"/>
-      </w:pPr>
-      <w:r>
-        <w:t xml:space="preserve">Courses → Enrollments.courseId (1:M, mandatory)</w:t>
-      </w:r>
-    </w:p>
-    <w:p>
-      <w:pPr>
-        <w:pStyle w:val="ListParagraph"/>
-        <w:numPr>
-          <w:ilvl w:val="0"/>
-          <w:numId w:val="1"/>
-        </w:numPr>
-        <w:spacing w:after="70"/>
-      </w:pPr>
-      <w:r>
-        <w:t xml:space="preserve">Majors → Enrollments.majorId (1:M, nullable — most Courses have no Major)</w:t>
-      </w:r>
-    </w:p>
-    <w:p>
-      <w:pPr>
-        <w:pStyle w:val="ListParagraph"/>
-        <w:numPr>
-          <w:ilvl w:val="0"/>
-          <w:numId w:val="1"/>
-        </w:numPr>
-        <w:spacing w:after="70"/>
-      </w:pPr>
-      <w:r>
-        <w:t xml:space="preserve">AcademicTerms → Enrollments.termId (1:M, mandatory)</w:t>
-      </w:r>
-    </w:p>
-    <w:p>
-      <w:pPr>
-        <w:pStyle w:val="ListParagraph"/>
-        <w:numPr>
-          <w:ilvl w:val="0"/>
-          <w:numId w:val="1"/>
-        </w:numPr>
-        <w:spacing w:after="70"/>
-      </w:pPr>
-      <w:r>
-        <w:t xml:space="preserve">Admissions → Enrollments.admissionId (1:1, nullable — continuing/irregular students have none)</w:t>
-      </w:r>
-    </w:p>
-    <w:p>
-      <w:pPr>
-        <w:pStyle w:val="ListParagraph"/>
-        <w:numPr>
-          <w:ilvl w:val="0"/>
-          <w:numId w:val="1"/>
-        </w:numPr>
-        <w:spacing w:after="70"/>
-      </w:pPr>
-      <w:r>
-        <w:t xml:space="preserve">Enrollments → CreditedSubjects.enrollmentId (1:M, mandatory)</w:t>
-      </w:r>
-    </w:p>
-    <w:p>
-      <w:pPr>
-        <w:pStyle w:val="ListParagraph"/>
-        <w:numPr>
-          <w:ilvl w:val="0"/>
-          <w:numId w:val="1"/>
-        </w:numPr>
-        <w:spacing w:after="70"/>
-      </w:pPr>
-      <w:r>
-        <w:t xml:space="preserve">TransferAcademicRecords → CreditedSubjects.transferRecordId (1:M, nullable)</w:t>
-      </w:r>
-    </w:p>
-    <w:p>
-      <w:pPr>
-        <w:pStyle w:val="ListParagraph"/>
-        <w:numPr>
-          <w:ilvl w:val="0"/>
-          <w:numId w:val="1"/>
-        </w:numPr>
-        <w:spacing w:after="70"/>
-      </w:pPr>
-      <w:r>
-        <w:t xml:space="preserve">Subjects → CreditedSubjects.creditedToSubjectId (1:M, nullable)</w:t>
-      </w:r>
-    </w:p>
-    <w:p>
-      <w:pPr>
-        <w:pStyle w:val="Heading3"/>
-        <w:spacing w:after="100" w:before="200"/>
-      </w:pPr>
-      <w:r>
-        <w:t xml:space="preserve">Data Flow</w:t>
-      </w:r>
-    </w:p>
-    <w:p>
-      <w:pPr>
-        <w:spacing w:after="140"/>
-      </w:pPr>
-      <w:r>
-        <w:t xml:space="preserve">This is where the term's Enrollments row is born — every later phase (payment, registrar approval, blocking, ID) references this same row rather than re-deriving student/term/course independently.</w:t>
-      </w:r>
-    </w:p>
-    <w:p>
-      <w:pPr>
-        <w:pStyle w:val="Heading2"/>
-        <w:spacing w:after="140" w:before="280"/>
-      </w:pPr>
-      <w:r>
-        <w:t xml:space="preserve">Phase 2 — Clearance Verification (Continuing and Irregular Students)</w:t>
-      </w:r>
-    </w:p>
-    <w:p>
-      <w:pPr>
-        <w:spacing w:after="140"/>
-      </w:pPr>
-      <w:r>
-        <w:rPr>
-          <w:b/>
-          <w:bCs/>
-        </w:rPr>
-        <w:t xml:space="preserve">Purpose:</w:t>
-      </w:r>
-      <w:r>
-        <w:t xml:space="preserve"> Confirm the student has no outstanding obligations from the term that just ended, before they're allowed to proceed.</w:t>
-      </w:r>
-    </w:p>
-    <w:p>
-      <w:pPr>
-        <w:spacing w:after="140"/>
-      </w:pPr>
-      <w:r>
-        <w:rPr>
-          <w:b/>
-          <w:bCs/>
-        </w:rPr>
-        <w:t xml:space="preserve">Who performs it:</w:t>
-      </w:r>
-      <w:r>
-        <w:t xml:space="preserve"> Safety and Security, SSC, Library, Scholarship Office, and the Dean/Program Head desk (whichever applies) sign; Registrar ultimately receives the completed form.</w:t>
-      </w:r>
-    </w:p>
-    <w:p>
-      <w:pPr>
-        <w:pStyle w:val="Heading3"/>
-        <w:spacing w:after="100" w:before="200"/>
-      </w:pPr>
-      <w:r>
-        <w:t xml:space="preserve">External (Applicant / Student / Third Party)</w:t>
-      </w:r>
-    </w:p>
-    <w:p>
-      <w:pPr>
-        <w:pStyle w:val="ListParagraph"/>
-        <w:numPr>
-          <w:ilvl w:val="0"/>
-          <w:numId w:val="1"/>
-        </w:numPr>
-        <w:spacing w:after="70"/>
-      </w:pPr>
-      <w:r>
-        <w:t xml:space="preserve">Student visits each of the five offices (in whatever order the school allows) to obtain a signature.</w:t>
-      </w:r>
-    </w:p>
-    <w:p>
-      <w:pPr>
-        <w:pStyle w:val="ListParagraph"/>
-        <w:numPr>
-          <w:ilvl w:val="0"/>
-          <w:numId w:val="1"/>
-        </w:numPr>
-        <w:spacing w:after="70"/>
-      </w:pPr>
-      <w:r>
-        <w:t xml:space="preserve">Student submits the completed clearance form to the Registrar (see Phase 5) — the office keeps one copy, the student keeps the other (a printing detail, not two different records).</w:t>
-      </w:r>
-    </w:p>
-    <w:p>
-      <w:pPr>
-        <w:pStyle w:val="Heading3"/>
-        <w:spacing w:after="100" w:before="200"/>
-      </w:pPr>
-      <w:r>
-        <w:t xml:space="preserve">Internal (Staff, Office, and System Actions/Decisions)</w:t>
-      </w:r>
-    </w:p>
-    <w:p>
-      <w:pPr>
-        <w:pStyle w:val="ListParagraph"/>
-        <w:numPr>
-          <w:ilvl w:val="0"/>
-          <w:numId w:val="1"/>
-        </w:numPr>
-        <w:spacing w:after="70"/>
-      </w:pPr>
-      <w:r>
-        <w:t xml:space="preserve">Action: once a term ends, a ClearancePeriods row is opened for it, with its own submission window.</w:t>
-      </w:r>
-    </w:p>
-    <w:p>
-      <w:pPr>
-        <w:pStyle w:val="ListParagraph"/>
-        <w:numPr>
-          <w:ilvl w:val="0"/>
-          <w:numId w:val="1"/>
-        </w:numPr>
-        <w:spacing w:after="70"/>
-      </w:pPr>
-      <w:r>
-        <w:t xml:space="preserve">Action: a StudentClearances row is created per student needing clearance, for that period.</w:t>
-      </w:r>
-    </w:p>
-    <w:p>
-      <w:pPr>
-        <w:pStyle w:val="ListParagraph"/>
-        <w:numPr>
-          <w:ilvl w:val="0"/>
-          <w:numId w:val="1"/>
-        </w:numPr>
-        <w:spacing w:after="70"/>
-      </w:pPr>
-      <w:r>
-        <w:t xml:space="preserve">Action: each required office records its own ClearanceApprovals row as the student is signed off.</w:t>
-      </w:r>
-    </w:p>
-    <w:p>
-      <w:pPr>
-        <w:pStyle w:val="ListParagraph"/>
-        <w:numPr>
-          <w:ilvl w:val="0"/>
-          <w:numId w:val="1"/>
-        </w:numPr>
-        <w:spacing w:after="70"/>
-      </w:pPr>
-      <w:r>
-        <w:t xml:space="preserve">Decision: once every required ClearanceApprovals row is approved, StudentClearances.overallStatus becomes 'approved'.</w:t>
-      </w:r>
-    </w:p>
-    <w:p>
-      <w:pPr>
-        <w:pStyle w:val="ListParagraph"/>
-        <w:numPr>
-          <w:ilvl w:val="0"/>
-          <w:numId w:val="1"/>
-        </w:numPr>
-        <w:spacing w:after="70"/>
-      </w:pPr>
-      <w:r>
-        <w:t xml:space="preserve">Decision (situational): if a specific student needs more time, StudentClearances.extendedDeadline is set for them individually, without reopening the window school-wide; a school-wide extension instead updates ClearancePeriods.periodStatus/dates directly.</w:t>
-      </w:r>
-    </w:p>
-    <w:p>
-      <w:pPr>
-        <w:pStyle w:val="Heading3"/>
-        <w:spacing w:after="100" w:before="200"/>
-      </w:pPr>
-      <w:r>
-        <w:t xml:space="preserve">Tables and Key Attributes Involved</w:t>
-      </w:r>
-    </w:p>
     <w:tbl>
       <w:tblPr>
         <w:tblW w:type="dxa" w:w="9360"/>
@@ -2032,14 +1565,35 @@
     </w:tbl>
     <w:p>
       <w:pPr>
+        <w:pStyle w:val="Heading2"/>
+        <w:spacing w:after="140" w:before="280"/>
+      </w:pPr>
+      <w:r>
+        <w:t xml:space="preserve">Phase 1 — Clearance Verification: "The Clearance Slip"</w:t>
+      </w:r>
+    </w:p>
+    <w:p>
+      <w:pPr>
         <w:spacing w:after="140"/>
       </w:pPr>
       <w:r>
         <w:rPr>
-          <w:sz w:val="2"/>
-          <w:szCs w:val="2"/>
+          <w:b/>
+          <w:bCs/>
         </w:rPr>
-        <w:t xml:space="preserve"/>
+        <w:t xml:space="preserve">Purpose: Confirm the student has no outstanding obligations from the term that just ended, before they're allowed to proceed. Clearance is issued when a semester ends — usually for continuing students, but every student's clearance is issued by their college department. One clearance slip per student, free.</w:t>
+      </w:r>
+    </w:p>
+    <w:p>
+      <w:pPr>
+        <w:spacing w:after="140"/>
+      </w:pPr>
+      <w:r>
+        <w:rPr>
+          <w:b/>
+          <w:bCs/>
+        </w:rPr>
+        <w:t xml:space="preserve">Who performs it: the college department issues the slip; the student completes it within the 1–2 week window and submits it to the Registrar desk — a different registrar staff member than the one in Phase 5. Not part of the Enrollment Workflow Process form.</w:t>
       </w:r>
     </w:p>
     <w:p>
@@ -2048,7 +1602,7 @@
         <w:spacing w:after="100" w:before="200"/>
       </w:pPr>
       <w:r>
-        <w:t xml:space="preserve">Relationships and Cardinality Active in This Phase</w:t>
+        <w:t xml:space="preserve">External (Applicant / Student / Third Party)</w:t>
       </w:r>
     </w:p>
     <w:p>
@@ -2061,7 +1615,7 @@
         <w:spacing w:after="70"/>
       </w:pPr>
       <w:r>
-        <w:t xml:space="preserve">AcademicTerms → ClearancePeriods.termId (1:M, mandatory)</w:t>
+        <w:t xml:space="preserve">Student completes the clearance slip within the clearance period (a 1–2 week window; ClearancePeriods.periodStatus = 'open').</w:t>
       </w:r>
     </w:p>
     <w:p>
@@ -2074,7 +1628,7 @@
         <w:spacing w:after="70"/>
       </w:pPr>
       <w:r>
-        <w:t xml:space="preserve">Offices → ClearanceRequirements.officeId (1:M, mandatory)</w:t>
+        <w:t xml:space="preserve">Student submits the completed clearance slip to the Registrar desk — the office keeps one copy, the student keeps the student copy (mandatory at Phase 5).</w:t>
       </w:r>
     </w:p>
     <w:p>
@@ -2087,7 +1641,7 @@
         <w:spacing w:after="70"/>
       </w:pPr>
       <w:r>
-        <w:t xml:space="preserve">Students → StudentClearances.studentId (1:M, mandatory)</w:t>
+        <w:t xml:space="preserve">If the window passes without submission, the registrar will no longer entertain it — the student must wait and do it first when enrollment starts after the break.</w:t>
       </w:r>
     </w:p>
     <w:p>
@@ -2100,7 +1654,16 @@
         <w:spacing w:after="70"/>
       </w:pPr>
       <w:r>
-        <w:t xml:space="preserve">ClearancePeriods → StudentClearances.clearancePeriodId (1:M, mandatory)</w:t>
+        <w:t xml:space="preserve">Lost slip: pay ₱100 at Accounting (feeTypeId 11, Clearance Slip Replacement, flat), show the receipt to the college department, receive a new copy.</w:t>
+      </w:r>
+    </w:p>
+    <w:p>
+      <w:pPr>
+        <w:pStyle w:val="Heading3"/>
+        <w:spacing w:after="100" w:before="200"/>
+      </w:pPr>
+      <w:r>
+        <w:t xml:space="preserve">Internal (Staff, Office, and System Actions/Decisions)</w:t>
       </w:r>
     </w:p>
     <w:p>
@@ -2113,7 +1676,7 @@
         <w:spacing w:after="70"/>
       </w:pPr>
       <w:r>
-        <w:t xml:space="preserve">StudentClearances → ClearanceApprovals.studentClearanceId (1:M, mandatory)</w:t>
+        <w:t xml:space="preserve">Action: once a term ends, a ClearancePeriods row is opened for it, with its own submission window.</w:t>
       </w:r>
     </w:p>
     <w:p>
@@ -2126,7 +1689,7 @@
         <w:spacing w:after="70"/>
       </w:pPr>
       <w:r>
-        <w:t xml:space="preserve">ClearanceRequirements → ClearanceApprovals.clearanceRequirementId (1:M, mandatory)</w:t>
+        <w:t xml:space="preserve">Action: a StudentClearances row is created per student needing clearance, for that period.</w:t>
       </w:r>
     </w:p>
     <w:p>
@@ -2139,7 +1702,66 @@
         <w:spacing w:after="70"/>
       </w:pPr>
       <w:r>
-        <w:t xml:space="preserve">StaffUsers → ClearanceApprovals.approvedBy (1:M, nullable — empty until that specific office actually signs)</w:t>
+        <w:t xml:space="preserve">Action: each required office records its own ClearanceApprovals row as the student is signed off.</w:t>
+      </w:r>
+    </w:p>
+    <w:p>
+      <w:pPr>
+        <w:pStyle w:val="ListParagraph"/>
+        <w:numPr>
+          <w:ilvl w:val="0"/>
+          <w:numId w:val="1"/>
+        </w:numPr>
+        <w:spacing w:after="70"/>
+      </w:pPr>
+      <w:r>
+        <w:t xml:space="preserve">Decision: once every required ClearanceApprovals row is approved, StudentClearances.overallStatus becomes 'approved'.</w:t>
+      </w:r>
+    </w:p>
+    <w:p>
+      <w:pPr>
+        <w:pStyle w:val="ListParagraph"/>
+        <w:numPr>
+          <w:ilvl w:val="0"/>
+          <w:numId w:val="1"/>
+        </w:numPr>
+        <w:spacing w:after="70"/>
+      </w:pPr>
+      <w:r>
+        <w:t xml:space="preserve">Decision (situational): if a specific student needs more time, StudentClearances.extendedDeadline is set for them individually, without reopening the window school-wide; a school-wide extension instead updates ClearancePeriods.periodStatus/dates directly.</w:t>
+      </w:r>
+    </w:p>
+    <w:p>
+      <w:pPr>
+        <w:pStyle w:val="ListParagraph"/>
+        <w:numPr>
+          <w:ilvl w:val="0"/>
+          <w:numId w:val="1"/>
+        </w:numPr>
+        <w:spacing w:after="70"/>
+      </w:pPr>
+      <w:r>
+        <w:t xml:space="preserve">Important: clearance is NOT part of the Enrollment Workflow Process form — it is tracked in its own tables (StudentClearances, ClearanceApprovals), not on the 8-step workflow form.</w:t>
+      </w:r>
+    </w:p>
+    <w:p>
+      <w:r>
+        <w:t>What's printed on the clearance slip:</w:t>
+      </w:r>
+    </w:p>
+    <w:p>
+      <w:r>
+        <w:t>The clearance slip is a printed form. Each copy shows: the semester term, the academic school year, the student's full name, and their course and year (e.g., BS Computer Science — 1st Year). It carries no student ID field — identification relies on name and course/year. Each student receives exactly one copy in record, free; the slip ties back to StudentClearances.studentClearanceId. A “date to be signed” line is printed — the date by which the student must have it signed and submitted.</w:t>
+      </w:r>
+    </w:p>
+    <w:p>
+      <w:r>
+        <w:t>The “Received by” section is printed with the Registrar in-charge's signature over their printed name when the student submits the completed slip at the Registrar desk during the clearance period. The receiving staff member is recorded in StudentClearances.receivedBy (FK → StaffUsers.userId) with receivedDate.</w:t>
+      </w:r>
+    </w:p>
+    <w:p>
+      <w:r>
+        <w:t>The student copy is the copy the student keeps after submission — used for verification at the Academic Evaluation (Phase 2) and mandatory at the Registrar phase (Phase 5).</w:t>
       </w:r>
     </w:p>
     <w:p>
@@ -2148,6 +1770,127 @@
         <w:spacing w:after="100" w:before="200"/>
       </w:pPr>
       <w:r>
+        <w:t xml:space="preserve">Tables and Key Attributes Involved</w:t>
+      </w:r>
+    </w:p>
+    <w:p>
+      <w:pPr>
+        <w:spacing w:after="140"/>
+      </w:pPr>
+      <w:r>
+        <w:rPr>
+          <w:sz w:val="2"/>
+          <w:szCs w:val="2"/>
+        </w:rPr>
+        <w:t xml:space="preserve"/>
+      </w:r>
+    </w:p>
+    <w:p>
+      <w:pPr>
+        <w:pStyle w:val="Heading3"/>
+        <w:spacing w:after="100" w:before="200"/>
+      </w:pPr>
+      <w:r>
+        <w:t xml:space="preserve">Relationships and Cardinality Active in This Phase</w:t>
+      </w:r>
+    </w:p>
+    <w:p>
+      <w:pPr>
+        <w:pStyle w:val="ListParagraph"/>
+        <w:numPr>
+          <w:ilvl w:val="0"/>
+          <w:numId w:val="1"/>
+        </w:numPr>
+        <w:spacing w:after="70"/>
+      </w:pPr>
+      <w:r>
+        <w:t xml:space="preserve">AcademicTerms → ClearancePeriods.termId (1:M, mandatory)</w:t>
+      </w:r>
+    </w:p>
+    <w:p>
+      <w:pPr>
+        <w:pStyle w:val="ListParagraph"/>
+        <w:numPr>
+          <w:ilvl w:val="0"/>
+          <w:numId w:val="1"/>
+        </w:numPr>
+        <w:spacing w:after="70"/>
+      </w:pPr>
+      <w:r>
+        <w:t xml:space="preserve">Offices → ClearanceRequirements.officeId (1:M, mandatory)</w:t>
+      </w:r>
+    </w:p>
+    <w:p>
+      <w:pPr>
+        <w:pStyle w:val="ListParagraph"/>
+        <w:numPr>
+          <w:ilvl w:val="0"/>
+          <w:numId w:val="1"/>
+        </w:numPr>
+        <w:spacing w:after="70"/>
+      </w:pPr>
+      <w:r>
+        <w:t xml:space="preserve">Students → StudentClearances.studentId (1:M, mandatory)</w:t>
+      </w:r>
+    </w:p>
+    <w:p>
+      <w:pPr>
+        <w:pStyle w:val="ListParagraph"/>
+        <w:numPr>
+          <w:ilvl w:val="0"/>
+          <w:numId w:val="1"/>
+        </w:numPr>
+        <w:spacing w:after="70"/>
+      </w:pPr>
+      <w:r>
+        <w:t xml:space="preserve">ClearancePeriods → StudentClearances.clearancePeriodId (1:M, mandatory)</w:t>
+      </w:r>
+    </w:p>
+    <w:p>
+      <w:pPr>
+        <w:pStyle w:val="ListParagraph"/>
+        <w:numPr>
+          <w:ilvl w:val="0"/>
+          <w:numId w:val="1"/>
+        </w:numPr>
+        <w:spacing w:after="70"/>
+      </w:pPr>
+      <w:r>
+        <w:t xml:space="preserve">StudentClearances → ClearanceApprovals.studentClearanceId (1:M, mandatory)</w:t>
+      </w:r>
+    </w:p>
+    <w:p>
+      <w:pPr>
+        <w:pStyle w:val="ListParagraph"/>
+        <w:numPr>
+          <w:ilvl w:val="0"/>
+          <w:numId w:val="1"/>
+        </w:numPr>
+        <w:spacing w:after="70"/>
+      </w:pPr>
+      <w:r>
+        <w:t xml:space="preserve">ClearanceRequirements → ClearanceApprovals.clearanceRequirementId (1:M, mandatory)</w:t>
+      </w:r>
+    </w:p>
+    <w:p>
+      <w:pPr>
+        <w:pStyle w:val="ListParagraph"/>
+        <w:numPr>
+          <w:ilvl w:val="0"/>
+          <w:numId w:val="1"/>
+        </w:numPr>
+        <w:spacing w:after="70"/>
+      </w:pPr>
+      <w:r>
+        <w:t xml:space="preserve">StaffUsers → ClearanceApprovals.approvedBy (1:M, nullable — empty until that specific office actually signs)</w:t>
+      </w:r>
+    </w:p>
+    <w:p>
+      <w:pPr>
+        <w:pStyle w:val="Heading3"/>
+        <w:spacing w:after="100" w:before="200"/>
+      </w:pPr>
+      <w:r>
         <w:t xml:space="preserve">Data Flow</w:t>
       </w:r>
     </w:p>
@@ -2156,7 +1899,341 @@
         <w:spacing w:after="140"/>
       </w:pPr>
       <w:r>
-        <w:t xml:space="preserve">Five ClearanceApprovals rows (one per required office) accumulate under a single StudentClearances row; the Registrar phase later checks that row's overallStatus rather than checking each office individually.</w:t>
+        <w:rPr>
+          <w:b/>
+          <w:bCs/>
+        </w:rPr>
+        <w:t xml:space="preserve">ClearanceApprovals rows (one per required office) accumulate under a single StudentClearances row; the student copy is mandatory at Phase 5 (Registrar), where the registrar checks StudentClearances.overallStatus.</w:t>
+      </w:r>
+    </w:p>
+    <w:p>
+      <w:pPr>
+        <w:pStyle w:val="Heading2"/>
+        <w:spacing w:after="140" w:before="280"/>
+      </w:pPr>
+      <w:r>
+        <w:t xml:space="preserve">Phase 2 — Academic Department Evaluation</w:t>
+      </w:r>
+    </w:p>
+    <w:p>
+      <w:pPr>
+        <w:spacing w:after="140"/>
+      </w:pPr>
+      <w:r>
+        <w:rPr>
+          <w:b/>
+          <w:bCs/>
+        </w:rPr>
+        <w:t xml:space="preserve">Purpose: Issue the enrollment form, confirm the student's Course/Major, evaluate prior standing, and set the term's subject load.</w:t>
+      </w:r>
+    </w:p>
+    <w:p>
+      <w:pPr>
+        <w:spacing w:after="140"/>
+      </w:pPr>
+      <w:r>
+        <w:rPr>
+          <w:b/>
+          <w:bCs/>
+        </w:rPr>
+        <w:t xml:space="preserve">Who performs it: Academic Department staff (evaluator); the student (presenting the clearance slip student copy from Phase 1).</w:t>
+      </w:r>
+    </w:p>
+    <w:p>
+      <w:pPr>
+        <w:pStyle w:val="Heading3"/>
+        <w:spacing w:after="100" w:before="200"/>
+      </w:pPr>
+      <w:r>
+        <w:t xml:space="preserve">External (Applicant / Student / Third Party)</w:t>
+      </w:r>
+    </w:p>
+    <w:p>
+      <w:pPr>
+        <w:pStyle w:val="ListParagraph"/>
+        <w:numPr>
+          <w:ilvl w:val="0"/>
+          <w:numId w:val="1"/>
+        </w:numPr>
+        <w:spacing w:after="70"/>
+      </w:pPr>
+      <w:r>
+        <w:t xml:space="preserve">Student lines up — clearance slip student copy already in hand from Phase 1 — receives the enrollment form, and fills in the required personal and term information.</w:t>
+      </w:r>
+    </w:p>
+    <w:p>
+      <w:pPr>
+        <w:pStyle w:val="ListParagraph"/>
+        <w:numPr>
+          <w:ilvl w:val="0"/>
+          <w:numId w:val="1"/>
+        </w:numPr>
+        <w:spacing w:after="70"/>
+      </w:pPr>
+      <w:r>
+        <w:t xml:space="preserve">Board-course continuing students (2nd–5th year) first take the retention exam (see the Decision below) before the enrollment form is issued and evaluated.</w:t>
+      </w:r>
+    </w:p>
+    <w:p>
+      <w:pPr>
+        <w:pStyle w:val="ListParagraph"/>
+        <w:numPr>
+          <w:ilvl w:val="0"/>
+          <w:numId w:val="1"/>
+        </w:numPr>
+        <w:spacing w:after="70"/>
+      </w:pPr>
+      <w:r>
+        <w:t xml:space="preserve">Transferee/shifter: bring prior academic records for crediting.</w:t>
+      </w:r>
+    </w:p>
+    <w:p>
+      <w:pPr>
+        <w:pStyle w:val="Heading3"/>
+        <w:spacing w:after="100" w:before="200"/>
+      </w:pPr>
+      <w:r>
+        <w:t xml:space="preserve">Internal (Staff, Office, and System Actions/Decisions)</w:t>
+      </w:r>
+    </w:p>
+    <w:p>
+      <w:pPr>
+        <w:pStyle w:val="ListParagraph"/>
+        <w:numPr>
+          <w:ilvl w:val="0"/>
+          <w:numId w:val="1"/>
+        </w:numPr>
+        <w:spacing w:after="70"/>
+      </w:pPr>
+      <w:r>
+        <w:t xml:space="preserve">Decision: for continuing/irregular students in board courses, check the retention exam result (ExamResults with examStage='retention') first — a failed result blocks the enrollment form. Then evaluate the prior term's EnrolledSubjects.grade values against GradeScale to determine passing/failing, setting the new Enrollments.academicStanding to 'regular' or 'irregular'.</w:t>
+      </w:r>
+    </w:p>
+    <w:p>
+      <w:pPr>
+        <w:pStyle w:val="ListParagraph"/>
+        <w:numPr>
+          <w:ilvl w:val="0"/>
+          <w:numId w:val="1"/>
+        </w:numPr>
+        <w:spacing w:after="70"/>
+      </w:pPr>
+      <w:r>
+        <w:t xml:space="preserve">Decision: for transferees/shifters, evaluate TransferAcademicRecords rows and determine which are credited, creating CreditedSubjects rows.</w:t>
+      </w:r>
+    </w:p>
+    <w:p>
+      <w:pPr>
+        <w:pStyle w:val="ListParagraph"/>
+        <w:numPr>
+          <w:ilvl w:val="0"/>
+          <w:numId w:val="1"/>
+        </w:numPr>
+        <w:spacing w:after="70"/>
+      </w:pPr>
+      <w:r>
+        <w:t xml:space="preserve">Action: create the Enrollments row for this term — Student, Course, Major (if any), term, studentType, academicStanding, and the originating Admissions row where applicable.</w:t>
+      </w:r>
+    </w:p>
+    <w:p>
+      <w:r>
+        <w:t>The enrollment form (what's on it):</w:t>
+      </w:r>
+    </w:p>
+    <w:p>
+      <w:r>
+        <w:t>The Enrollment Form is the printed form the student fills at the department. It has two parts. Part 1 — the complete demographic profile; every field must be filled before the form can be submitted:</w:t>
+      </w:r>
+    </w:p>
+    <w:p>
+      <w:r>
+        <w:t>Name (normalized: Last name, First name, Middle initial) and suffix (if any); sex/gender; date of birth and place of birth; religion and citizenship; civil status (Students.civilStatus: single/married/widowed/separated); full address — lot/block, street name, purok/sitio, barangay, city/municipality, district, province, region, country (Addresses table); current address with a “same as above” checkbox (when ticked, the current address copies the home address — both are stored as separate Addresses rows, addressType 'home' and 'current', even when identical); telephone number and contact (mobile) number (Students.telephoneNumber, Students.contactNumber); email address and mailing address; current semester completed — total semesters attended (Students.semestersCompleted); years in institution (Students.yearsInInstitution); father's name and contact number, mother's name and contact number, and guardian's name and contact number in case of emergency (Guardians table, with the emergency-contact flag).</w:t>
+      </w:r>
+    </w:p>
+    <w:p>
+      <w:r>
+        <w:t>Part 2 — the subject load, attached under the profile: the evaluator lists the subjects the student may take, each with subject name, subject code, and lecture/lab units. Also printed: Regular/Irregular checkboxes (maps to Enrollments.academicStanding), the form issue date (Enrollments.formIssuedDate — today's date when the form is handed out), and the signature lines: Evaluator (instructor) and Dean/Program Head sign at this phase; Registrar signs later at Phase 5; the student signs with the signed date (Enrollments.formSignedDate). The form cannot be submitted until every profile field is filled and the subject load is attached.</w:t>
+      </w:r>
+    </w:p>
+    <w:p>
+      <w:pPr>
+        <w:pStyle w:val="ListParagraph"/>
+        <w:numPr>
+          <w:ilvl w:val="0"/>
+          <w:numId w:val="1"/>
+        </w:numPr>
+        <w:spacing w:after="70"/>
+      </w:pPr>
+      <w:r>
+        <w:t xml:space="preserve">Action: record the evaluator on Enrollments.evaluatedBy; the evaluator signs the enrollment form with the subject load.</w:t>
+      </w:r>
+    </w:p>
+    <w:p>
+      <w:pPr>
+        <w:pStyle w:val="ListParagraph"/>
+        <w:numPr>
+          <w:ilvl w:val="0"/>
+          <w:numId w:val="1"/>
+        </w:numPr>
+        <w:spacing w:after="70"/>
+      </w:pPr>
+      <w:r>
+        <w:t xml:space="preserve">Action: record a WorkflowSteps row for this office.</w:t>
+      </w:r>
+    </w:p>
+    <w:p>
+      <w:pPr>
+        <w:pStyle w:val="Heading3"/>
+        <w:spacing w:after="100" w:before="200"/>
+      </w:pPr>
+      <w:r>
+        <w:t xml:space="preserve">Tables and Key Attributes Involved</w:t>
+      </w:r>
+    </w:p>
+    <w:p>
+      <w:pPr>
+        <w:spacing w:after="140"/>
+      </w:pPr>
+      <w:r>
+        <w:rPr>
+          <w:sz w:val="2"/>
+          <w:szCs w:val="2"/>
+        </w:rPr>
+        <w:t xml:space="preserve"/>
+      </w:r>
+    </w:p>
+    <w:p>
+      <w:pPr>
+        <w:pStyle w:val="Heading3"/>
+        <w:spacing w:after="100" w:before="200"/>
+      </w:pPr>
+      <w:r>
+        <w:t xml:space="preserve">Relationships and Cardinality Active in This Phase</w:t>
+      </w:r>
+    </w:p>
+    <w:p>
+      <w:pPr>
+        <w:pStyle w:val="ListParagraph"/>
+        <w:numPr>
+          <w:ilvl w:val="0"/>
+          <w:numId w:val="1"/>
+        </w:numPr>
+        <w:spacing w:after="70"/>
+      </w:pPr>
+      <w:r>
+        <w:t xml:space="preserve">Students → Enrollments.studentId (1:M, mandatory)</w:t>
+      </w:r>
+    </w:p>
+    <w:p>
+      <w:pPr>
+        <w:pStyle w:val="ListParagraph"/>
+        <w:numPr>
+          <w:ilvl w:val="0"/>
+          <w:numId w:val="1"/>
+        </w:numPr>
+        <w:spacing w:after="70"/>
+      </w:pPr>
+      <w:r>
+        <w:t xml:space="preserve">Courses → Enrollments.courseId (1:M, mandatory)</w:t>
+      </w:r>
+    </w:p>
+    <w:p>
+      <w:pPr>
+        <w:pStyle w:val="ListParagraph"/>
+        <w:numPr>
+          <w:ilvl w:val="0"/>
+          <w:numId w:val="1"/>
+        </w:numPr>
+        <w:spacing w:after="70"/>
+      </w:pPr>
+      <w:r>
+        <w:t xml:space="preserve">Majors → Enrollments.majorId (1:M, nullable — most Courses have no Major)</w:t>
+      </w:r>
+    </w:p>
+    <w:p>
+      <w:pPr>
+        <w:pStyle w:val="ListParagraph"/>
+        <w:numPr>
+          <w:ilvl w:val="0"/>
+          <w:numId w:val="1"/>
+        </w:numPr>
+        <w:spacing w:after="70"/>
+      </w:pPr>
+      <w:r>
+        <w:t xml:space="preserve">AcademicTerms → Enrollments.termId (1:M, mandatory)</w:t>
+      </w:r>
+    </w:p>
+    <w:p>
+      <w:pPr>
+        <w:pStyle w:val="ListParagraph"/>
+        <w:numPr>
+          <w:ilvl w:val="0"/>
+          <w:numId w:val="1"/>
+        </w:numPr>
+        <w:spacing w:after="70"/>
+      </w:pPr>
+      <w:r>
+        <w:t xml:space="preserve">Admissions → Enrollments.admissionId (1:1, nullable — continuing/irregular students have none)</w:t>
+      </w:r>
+    </w:p>
+    <w:p>
+      <w:pPr>
+        <w:pStyle w:val="ListParagraph"/>
+        <w:numPr>
+          <w:ilvl w:val="0"/>
+          <w:numId w:val="1"/>
+        </w:numPr>
+        <w:spacing w:after="70"/>
+      </w:pPr>
+      <w:r>
+        <w:t xml:space="preserve">Enrollments → CreditedSubjects.enrollmentId (1:M, mandatory)</w:t>
+      </w:r>
+    </w:p>
+    <w:p>
+      <w:pPr>
+        <w:pStyle w:val="ListParagraph"/>
+        <w:numPr>
+          <w:ilvl w:val="0"/>
+          <w:numId w:val="1"/>
+        </w:numPr>
+        <w:spacing w:after="70"/>
+      </w:pPr>
+      <w:r>
+        <w:t xml:space="preserve">TransferAcademicRecords → CreditedSubjects.transferRecordId (1:M, nullable)</w:t>
+      </w:r>
+    </w:p>
+    <w:p>
+      <w:pPr>
+        <w:pStyle w:val="ListParagraph"/>
+        <w:numPr>
+          <w:ilvl w:val="0"/>
+          <w:numId w:val="1"/>
+        </w:numPr>
+        <w:spacing w:after="70"/>
+      </w:pPr>
+      <w:r>
+        <w:t xml:space="preserve">Subjects → CreditedSubjects.creditedToSubjectId (1:M, nullable)</w:t>
+      </w:r>
+    </w:p>
+    <w:p>
+      <w:pPr>
+        <w:pStyle w:val="Heading3"/>
+        <w:spacing w:after="100" w:before="200"/>
+      </w:pPr>
+      <w:r>
+        <w:t xml:space="preserve">Data Flow</w:t>
+      </w:r>
+    </w:p>
+    <w:p>
+      <w:pPr>
+        <w:spacing w:after="140"/>
+      </w:pPr>
+      <w:r>
+        <w:rPr>
+          <w:b/>
+          <w:bCs/>
+        </w:rPr>
+        <w:t xml:space="preserve">This is where the term's Enrollments row is born — every later phase (payment, registrar approval, blocking, ID) references this same row rather than re-deriving student/term/course independently.</w:t>
       </w:r>
     </w:p>
     <w:p>
@@ -2851,14 +2928,7 @@
         <w:spacing w:after="140"/>
       </w:pPr>
       <w:r>
-        <w:rPr>
-          <w:b/>
-          <w:bCs/>
-        </w:rPr>
-        <w:t xml:space="preserve">Who performs it:</w:t>
-      </w:r>
-      <w:r>
-        <w:t xml:space="preserve"> Registrar staff; the student (submitting the enrollment form, clearance form, and — for first-years — PSA certificate).</w:t>
+        <w:t>Who performs it: Registrar staff; the student (submitting the enrollment form, the clearance slip student copy from Phase 1 — mandatory — and, for first-years, the PSA certificate).</w:t>
       </w:r>
     </w:p>
     <w:p>
@@ -2880,7 +2950,7 @@
         <w:spacing w:after="70"/>
       </w:pPr>
       <w:r>
-        <w:t xml:space="preserve">Student submits the enrollment form, tracking form, clearance (if applicable), and PSA (first-years) for verification.</w:t>
+        <w:t>Student submits the enrollment form, the clearance slip student copy (mandatory for all), tracking form, and PSA (first-years) for verification.</w:t>
       </w:r>
     </w:p>
     <w:p>
@@ -2915,7 +2985,7 @@
         <w:spacing w:after="70"/>
       </w:pPr>
       <w:r>
-        <w:t xml:space="preserve">Decision: verify Payments and (for continuing/irregular students) StudentClearances.overallStatus are both satisfactory.</w:t>
+        <w:t>Decision: verify Payments and StudentClearances.overallStatus (cleared in Phase 1) are both satisfactory.</w:t>
       </w:r>
     </w:p>
     <w:p>
@@ -2968,6 +3038,36 @@
       </w:pPr>
       <w:r>
         <w:t>Action: print the Subject Load and Enrollment Certificate, recording a DocumentPrintLog row per print (documentType 'subjectLoad'/'certificate').</w:t>
+      </w:r>
+    </w:p>
+    <w:p>
+      <w:r>
+        <w:t>Recording vs. updating student data:</w:t>
+      </w:r>
+    </w:p>
+    <w:p>
+      <w:r>
+        <w:t>The Registrar checks the subject load from the enrollment form, approves the subjects, then enrolls the student. Depending on student type, the system either records or updates the student's data. First year — the profile is new: Enrollments.enrollmentType = 'new'; the Registrar records the full student data (demographics, address, guardians) from the enrollment form. Transferee — also a new enrollment ('new'); previous school records are credited (TransferAcademicRecords, CreditedSubjects). Continuing — the student is already in the system: enrollmentType = 'old'; the Registrar updates the existing student data (address, contact numbers, semesters completed, years in institution). Shifter — also 'old'; existing data is updated with the new course. The rule is derived automatically: firstYear/transferee → 'new'; continuing/shifter → 'old'.</w:t>
+      </w:r>
+    </w:p>
+    <w:p>
+      <w:r>
+        <w:t>The Enrollment Certificate print:</w:t>
+      </w:r>
+    </w:p>
+    <w:p>
+      <w:r>
+        <w:t>The Enrollment Certificate Form (“Student Subject Load”) is the official proof of enrollment, printed with the complete subject loads. Header: school logo, school name, address, and telephone. Student information (pre-filled): full name — Last name, First name, Middle initial; course and year; student ID; school year (academic year) and semester; Type — 'new' or 'old' (Enrollments.enrollmentType), printed as “New” or “Old” student. The subject table: one row per enrolled subject (No., Subject Code, Description, Lecture Units, Lab Units, Total per row) with a Total Units row. Below the table: date enrolled (Enrollments.enrolledDate); Evaluated by — the printed name of the registrar evaluator (every staff member has their own login account in StaffUsers and signs in when processing); Processed by — the same name as Evaluated by (the evaluator who evaluated the enrollment also processes the print); Student Copy indication; and the “SEAIT ENROLLED” stamp applied by the printer as part of the print output. Each print is logged: DocumentPrintLog.documentType = 'certificate'.</w:t>
+      </w:r>
+    </w:p>
+    <w:p>
+      <w:r>
+        <w:t>The Class Card print:</w:t>
+      </w:r>
+    </w:p>
+    <w:p>
+      <w:r>
+        <w:t>A Class Card is printed per subject for the semester. Header: school logo, name, address, telephone, plus “Office of the Registrar”, the title “Class Card”, the semester, and the academic/school year. Student block: last/first/middle name; course and year; subject code, descriptive title, and units — the lecture and lab units summed (e.g., IT102 → 3 units). The empty boxes, filled by the instructor during the term: Set (the block, e.g., Block A), Time (class meeting time, from ScheduleMeetings), Day (meeting days), Grade (final grade), and Name and Signature of Instructor with Date. Footer: Issued by — the evaluator's printed name — and Date (when the card was processed/given). Each card print is logged: DocumentPrintLog.documentType = 'classCard'.</w:t>
       </w:r>
     </w:p>
     <w:p>
@@ -3318,6 +3418,16 @@
       </w:r>
     </w:p>
     <w:p>
+      <w:r>
+        <w:t>The Block and Schedule print:</w:t>
+      </w:r>
+    </w:p>
+    <w:p>
+      <w:r>
+        <w:t>The department also prints the Block and Schedule — the printed list of subjects with their meeting times, days, rooms, and instructors for the whole block (see Documentation/Images/Class Block and Schedule.jpg for the reference layout). It shows each subject with its code and descriptive title, Day and Time (from ScheduleMeetings — a subject can meet on multiple days), Room (Rooms table), and Instructor (the staff user assigned to the schedule). This print tells the student where to go for each class — it complements the class card, which carries the same meeting info in per-subject boxes.</w:t>
+      </w:r>
+    </w:p>
+    <w:p>
       <w:pPr>
         <w:pStyle w:val="ListParagraph"/>
         <w:numPr>
@@ -3700,7 +3810,7 @@
         <w:spacing w:after="140"/>
       </w:pPr>
       <w:r>
-        <w:t>EnrolledSubjects rows (created in Phase 1, confirmed in Phase 5) are updated here to point at a specific Blocks and Schedules row each; the block gives the student a fixed schedule of subjects, instructors, and rooms.</w:t>
+        <w:t>EnrolledSubjects rows (created in Phase 2, confirmed in Phase 5) are updated here to point at a specific Blocks and Schedules row each; the block gives the student a fixed schedule of subjects, instructors, and rooms.</w:t>
       </w:r>
     </w:p>
     <w:p>
@@ -4610,15 +4720,7 @@
           </w:tcPr>
           <w:p>
             <w:r>
-              <w:rPr>
-                <w:b w:val="false"/>
-                <w:bCs w:val="false"/>
-                <w:i w:val="false"/>
-                <w:iCs w:val="false"/>
-                <w:sz w:val="18"/>
-                <w:szCs w:val="18"/>
-              </w:rPr>
-              <w:t>0 → 0.5(if applicable) → 1 → 3 → 4 → 5 → 6 → 7 → 8</w:t>
+              <w:t>0 → 0.5(if applicable) → 1 → 2 → 3 → 4 → 5 → 6 → 7 → 8</w:t>
             </w:r>
           </w:p>
         </w:tc>
@@ -4641,15 +4743,7 @@
           </w:tcPr>
           <w:p>
             <w:r>
-              <w:rPr>
-                <w:b w:val="false"/>
-                <w:bCs w:val="false"/>
-                <w:i w:val="false"/>
-                <w:iCs w:val="false"/>
-                <w:sz w:val="18"/>
-                <w:szCs w:val="18"/>
-              </w:rPr>
-              <w:t xml:space="preserve">Full admission requirements apply; no Phase 2 (no prior term to clear).</w:t>
+              <w:t>Full admission requirements apply; first-year clearance obligations are waived (approvals auto-approved) but the slip is still issued and submitted.</w:t>
             </w:r>
           </w:p>
         </w:tc>
@@ -4736,15 +4830,7 @@
           </w:tcPr>
           <w:p>
             <w:r>
-              <w:rPr>
-                <w:b w:val="false"/>
-                <w:bCs w:val="false"/>
-                <w:i w:val="false"/>
-                <w:iCs w:val="false"/>
-                <w:sz w:val="18"/>
-                <w:szCs w:val="18"/>
-              </w:rPr>
-              <w:t>Skips Admission and the entrance exam; board-course continuing students take the Retention Exam before Phase 1; must clear Phase 2 before Phase 1 can complete.</w:t>
+              <w:t>Skips Admission and the entrance exam; clearance slip from the prior semester must be completed and submitted at Phase 1 (not part of the workflow form); board-course continuing students take the Retention Exam in Phase 2 before the enrollment form is issued.</w:t>
             </w:r>
           </w:p>
         </w:tc>
@@ -4831,15 +4917,7 @@
           </w:tcPr>
           <w:p>
             <w:r>
-              <w:rPr>
-                <w:b w:val="false"/>
-                <w:bCs w:val="false"/>
-                <w:i w:val="false"/>
-                <w:iCs w:val="false"/>
-                <w:sz w:val="18"/>
-                <w:szCs w:val="18"/>
-              </w:rPr>
-              <w:t xml:space="preserve">Same path as Continuing, but Phase 1 builds a mixed retake/new subject load per academicStanding='irregular'.</w:t>
+              <w:t>Same path as Continuing, but Phase 2 builds a mixed retake/new subject load per academicStanding='irregular'.</w:t>
             </w:r>
           </w:p>
         </w:tc>
@@ -4895,15 +4973,7 @@
           </w:tcPr>
           <w:p>
             <w:r>
-              <w:rPr>
-                <w:b w:val="false"/>
-                <w:bCs w:val="false"/>
-                <w:i w:val="false"/>
-                <w:iCs w:val="false"/>
-                <w:sz w:val="18"/>
-                <w:szCs w:val="18"/>
-              </w:rPr>
-              <w:t>0 → 1 → 3 → 4 → 5 → 6 → 7 → 8</w:t>
+              <w:t>0 → 1 → 2 → 3 → 4 → 5 → 6 → 7 → 8</w:t>
             </w:r>
           </w:p>
         </w:tc>
@@ -4926,15 +4996,7 @@
           </w:tcPr>
           <w:p>
             <w:r>
-              <w:rPr>
-                <w:b w:val="false"/>
-                <w:bCs w:val="false"/>
-                <w:i w:val="false"/>
-                <w:iCs w:val="false"/>
-                <w:sz w:val="18"/>
-                <w:szCs w:val="18"/>
-              </w:rPr>
-              <w:t xml:space="preserve">Goes through Admission like a first-year, but Phase 1 evaluates TransferAcademicRecords for CreditedSubjects instead of a fresh curriculum.</w:t>
+              <w:t>Goes through Admission like a first-year, but Phase 2 evaluates TransferAcademicRecords for CreditedSubjects instead of a fresh curriculum.</w:t>
             </w:r>
           </w:p>
         </w:tc>
@@ -5021,15 +5083,7 @@
           </w:tcPr>
           <w:p>
             <w:r>
-              <w:rPr>
-                <w:b w:val="false"/>
-                <w:bCs w:val="false"/>
-                <w:i w:val="false"/>
-                <w:iCs w:val="false"/>
-                <w:sz w:val="18"/>
-                <w:szCs w:val="18"/>
-              </w:rPr>
-              <w:t xml:space="preserve">Skips Admission like a continuing student, but Phase 1 evaluates their old program's completed subjects for CreditedSubjects.</w:t>
+              <w:t>Skips Admission like a continuing student, but Phase 2 evaluates their old program's completed subjects for CreditedSubjects.</w:t>
             </w:r>
           </w:p>
         </w:tc>
@@ -6729,6 +6783,274 @@
           </w:p>
         </w:tc>
       </w:tr>
+      <w:tr>
+        <w:tc>
+          <w:tcPr>
+            <w:tcW w:type="dxa" w:w="2200"/>
+            <w:tcBorders>
+              <w:top w:val="single" w:color="AAAAAA" w:sz="2"/>
+              <w:left w:val="single" w:color="AAAAAA" w:sz="2"/>
+              <w:bottom w:val="single" w:color="AAAAAA" w:sz="2"/>
+              <w:right w:val="single" w:color="AAAAAA" w:sz="2"/>
+            </w:tcBorders>
+            <w:tcMar>
+              <w:top w:type="dxa" w:w="70"/>
+              <w:left w:type="dxa" w:w="90"/>
+              <w:bottom w:type="dxa" w:w="70"/>
+              <w:right w:type="dxa" w:w="90"/>
+            </w:tcMar>
+            <w:vAlign w:val="center"/>
+          </w:tcPr>
+          <w:p>
+            <w:r>
+              <w:t>civilStatus</w:t>
+            </w:r>
+          </w:p>
+        </w:tc>
+        <w:tc>
+          <w:tcPr>
+            <w:tcW w:type="dxa" w:w="1400"/>
+            <w:tcBorders>
+              <w:top w:val="single" w:color="AAAAAA" w:sz="2"/>
+              <w:left w:val="single" w:color="AAAAAA" w:sz="2"/>
+              <w:bottom w:val="single" w:color="AAAAAA" w:sz="2"/>
+              <w:right w:val="single" w:color="AAAAAA" w:sz="2"/>
+            </w:tcBorders>
+            <w:tcMar>
+              <w:top w:type="dxa" w:w="70"/>
+              <w:left w:type="dxa" w:w="90"/>
+              <w:bottom w:type="dxa" w:w="70"/>
+              <w:right w:type="dxa" w:w="90"/>
+            </w:tcMar>
+            <w:vAlign w:val="center"/>
+          </w:tcPr>
+          <w:p>
+            <w:r/>
+          </w:p>
+        </w:tc>
+        <w:tc>
+          <w:tcPr>
+            <w:tcW w:type="dxa" w:w="5760"/>
+            <w:tcBorders>
+              <w:top w:val="single" w:color="AAAAAA" w:sz="2"/>
+              <w:left w:val="single" w:color="AAAAAA" w:sz="2"/>
+              <w:bottom w:val="single" w:color="AAAAAA" w:sz="2"/>
+              <w:right w:val="single" w:color="AAAAAA" w:sz="2"/>
+            </w:tcBorders>
+            <w:tcMar>
+              <w:top w:type="dxa" w:w="70"/>
+              <w:left w:type="dxa" w:w="90"/>
+              <w:bottom w:type="dxa" w:w="70"/>
+              <w:right w:type="dxa" w:w="90"/>
+            </w:tcMar>
+            <w:vAlign w:val="center"/>
+          </w:tcPr>
+          <w:p>
+            <w:r/>
+          </w:p>
+        </w:tc>
+      </w:tr>
+      <w:tr>
+        <w:tc>
+          <w:tcPr>
+            <w:tcW w:type="dxa" w:w="2200"/>
+            <w:tcBorders>
+              <w:top w:val="single" w:color="AAAAAA" w:sz="2"/>
+              <w:left w:val="single" w:color="AAAAAA" w:sz="2"/>
+              <w:bottom w:val="single" w:color="AAAAAA" w:sz="2"/>
+              <w:right w:val="single" w:color="AAAAAA" w:sz="2"/>
+            </w:tcBorders>
+            <w:tcMar>
+              <w:top w:type="dxa" w:w="70"/>
+              <w:left w:type="dxa" w:w="90"/>
+              <w:bottom w:type="dxa" w:w="70"/>
+              <w:right w:type="dxa" w:w="90"/>
+            </w:tcMar>
+            <w:vAlign w:val="center"/>
+          </w:tcPr>
+          <w:p>
+            <w:r>
+              <w:t>telephoneNumber</w:t>
+            </w:r>
+          </w:p>
+        </w:tc>
+        <w:tc>
+          <w:tcPr>
+            <w:tcW w:type="dxa" w:w="1400"/>
+            <w:tcBorders>
+              <w:top w:val="single" w:color="AAAAAA" w:sz="2"/>
+              <w:left w:val="single" w:color="AAAAAA" w:sz="2"/>
+              <w:bottom w:val="single" w:color="AAAAAA" w:sz="2"/>
+              <w:right w:val="single" w:color="AAAAAA" w:sz="2"/>
+            </w:tcBorders>
+            <w:tcMar>
+              <w:top w:type="dxa" w:w="70"/>
+              <w:left w:type="dxa" w:w="90"/>
+              <w:bottom w:type="dxa" w:w="70"/>
+              <w:right w:type="dxa" w:w="90"/>
+            </w:tcMar>
+            <w:vAlign w:val="center"/>
+          </w:tcPr>
+          <w:p>
+            <w:r/>
+          </w:p>
+        </w:tc>
+        <w:tc>
+          <w:tcPr>
+            <w:tcW w:type="dxa" w:w="5760"/>
+            <w:tcBorders>
+              <w:top w:val="single" w:color="AAAAAA" w:sz="2"/>
+              <w:left w:val="single" w:color="AAAAAA" w:sz="2"/>
+              <w:bottom w:val="single" w:color="AAAAAA" w:sz="2"/>
+              <w:right w:val="single" w:color="AAAAAA" w:sz="2"/>
+            </w:tcBorders>
+            <w:tcMar>
+              <w:top w:type="dxa" w:w="70"/>
+              <w:left w:type="dxa" w:w="90"/>
+              <w:bottom w:type="dxa" w:w="70"/>
+              <w:right w:type="dxa" w:w="90"/>
+            </w:tcMar>
+            <w:vAlign w:val="center"/>
+          </w:tcPr>
+          <w:p>
+            <w:r/>
+          </w:p>
+        </w:tc>
+      </w:tr>
+      <w:tr>
+        <w:tc>
+          <w:tcPr>
+            <w:tcW w:type="dxa" w:w="2200"/>
+            <w:tcBorders>
+              <w:top w:val="single" w:color="AAAAAA" w:sz="2"/>
+              <w:left w:val="single" w:color="AAAAAA" w:sz="2"/>
+              <w:bottom w:val="single" w:color="AAAAAA" w:sz="2"/>
+              <w:right w:val="single" w:color="AAAAAA" w:sz="2"/>
+            </w:tcBorders>
+            <w:tcMar>
+              <w:top w:type="dxa" w:w="70"/>
+              <w:left w:type="dxa" w:w="90"/>
+              <w:bottom w:type="dxa" w:w="70"/>
+              <w:right w:type="dxa" w:w="90"/>
+            </w:tcMar>
+            <w:vAlign w:val="center"/>
+          </w:tcPr>
+          <w:p>
+            <w:r>
+              <w:t>semestersCompleted</w:t>
+            </w:r>
+          </w:p>
+        </w:tc>
+        <w:tc>
+          <w:tcPr>
+            <w:tcW w:type="dxa" w:w="1400"/>
+            <w:tcBorders>
+              <w:top w:val="single" w:color="AAAAAA" w:sz="2"/>
+              <w:left w:val="single" w:color="AAAAAA" w:sz="2"/>
+              <w:bottom w:val="single" w:color="AAAAAA" w:sz="2"/>
+              <w:right w:val="single" w:color="AAAAAA" w:sz="2"/>
+            </w:tcBorders>
+            <w:tcMar>
+              <w:top w:type="dxa" w:w="70"/>
+              <w:left w:type="dxa" w:w="90"/>
+              <w:bottom w:type="dxa" w:w="70"/>
+              <w:right w:type="dxa" w:w="90"/>
+            </w:tcMar>
+            <w:vAlign w:val="center"/>
+          </w:tcPr>
+          <w:p>
+            <w:r/>
+          </w:p>
+        </w:tc>
+        <w:tc>
+          <w:tcPr>
+            <w:tcW w:type="dxa" w:w="5760"/>
+            <w:tcBorders>
+              <w:top w:val="single" w:color="AAAAAA" w:sz="2"/>
+              <w:left w:val="single" w:color="AAAAAA" w:sz="2"/>
+              <w:bottom w:val="single" w:color="AAAAAA" w:sz="2"/>
+              <w:right w:val="single" w:color="AAAAAA" w:sz="2"/>
+            </w:tcBorders>
+            <w:tcMar>
+              <w:top w:type="dxa" w:w="70"/>
+              <w:left w:type="dxa" w:w="90"/>
+              <w:bottom w:type="dxa" w:w="70"/>
+              <w:right w:type="dxa" w:w="90"/>
+            </w:tcMar>
+            <w:vAlign w:val="center"/>
+          </w:tcPr>
+          <w:p>
+            <w:r/>
+          </w:p>
+        </w:tc>
+      </w:tr>
+      <w:tr>
+        <w:tc>
+          <w:tcPr>
+            <w:tcW w:type="dxa" w:w="2200"/>
+            <w:tcBorders>
+              <w:top w:val="single" w:color="AAAAAA" w:sz="2"/>
+              <w:left w:val="single" w:color="AAAAAA" w:sz="2"/>
+              <w:bottom w:val="single" w:color="AAAAAA" w:sz="2"/>
+              <w:right w:val="single" w:color="AAAAAA" w:sz="2"/>
+            </w:tcBorders>
+            <w:tcMar>
+              <w:top w:type="dxa" w:w="70"/>
+              <w:left w:type="dxa" w:w="90"/>
+              <w:bottom w:type="dxa" w:w="70"/>
+              <w:right w:type="dxa" w:w="90"/>
+            </w:tcMar>
+            <w:vAlign w:val="center"/>
+          </w:tcPr>
+          <w:p>
+            <w:r>
+              <w:t>yearsInInstitution</w:t>
+            </w:r>
+          </w:p>
+        </w:tc>
+        <w:tc>
+          <w:tcPr>
+            <w:tcW w:type="dxa" w:w="1400"/>
+            <w:tcBorders>
+              <w:top w:val="single" w:color="AAAAAA" w:sz="2"/>
+              <w:left w:val="single" w:color="AAAAAA" w:sz="2"/>
+              <w:bottom w:val="single" w:color="AAAAAA" w:sz="2"/>
+              <w:right w:val="single" w:color="AAAAAA" w:sz="2"/>
+            </w:tcBorders>
+            <w:tcMar>
+              <w:top w:type="dxa" w:w="70"/>
+              <w:left w:type="dxa" w:w="90"/>
+              <w:bottom w:type="dxa" w:w="70"/>
+              <w:right w:type="dxa" w:w="90"/>
+            </w:tcMar>
+            <w:vAlign w:val="center"/>
+          </w:tcPr>
+          <w:p>
+            <w:r/>
+          </w:p>
+        </w:tc>
+        <w:tc>
+          <w:tcPr>
+            <w:tcW w:type="dxa" w:w="5760"/>
+            <w:tcBorders>
+              <w:top w:val="single" w:color="AAAAAA" w:sz="2"/>
+              <w:left w:val="single" w:color="AAAAAA" w:sz="2"/>
+              <w:bottom w:val="single" w:color="AAAAAA" w:sz="2"/>
+              <w:right w:val="single" w:color="AAAAAA" w:sz="2"/>
+            </w:tcBorders>
+            <w:tcMar>
+              <w:top w:type="dxa" w:w="70"/>
+              <w:left w:type="dxa" w:w="90"/>
+              <w:bottom w:type="dxa" w:w="70"/>
+              <w:right w:type="dxa" w:w="90"/>
+            </w:tcMar>
+            <w:vAlign w:val="center"/>
+          </w:tcPr>
+          <w:p>
+            <w:r/>
+          </w:p>
+        </w:tc>
+      </w:tr>
     </w:tbl>
     <w:p>
       <w:pPr>
@@ -8845,6 +9167,140 @@
           </w:p>
         </w:tc>
       </w:tr>
+      <w:tr>
+        <w:tc>
+          <w:tcPr>
+            <w:tcW w:type="dxa" w:w="2200"/>
+            <w:tcBorders>
+              <w:top w:val="single" w:color="AAAAAA" w:sz="2"/>
+              <w:left w:val="single" w:color="AAAAAA" w:sz="2"/>
+              <w:bottom w:val="single" w:color="AAAAAA" w:sz="2"/>
+              <w:right w:val="single" w:color="AAAAAA" w:sz="2"/>
+            </w:tcBorders>
+            <w:tcMar>
+              <w:top w:type="dxa" w:w="70"/>
+              <w:left w:type="dxa" w:w="90"/>
+              <w:bottom w:type="dxa" w:w="70"/>
+              <w:right w:type="dxa" w:w="90"/>
+            </w:tcMar>
+            <w:vAlign w:val="center"/>
+          </w:tcPr>
+          <w:p>
+            <w:r>
+              <w:t>district</w:t>
+            </w:r>
+          </w:p>
+        </w:tc>
+        <w:tc>
+          <w:tcPr>
+            <w:tcW w:type="dxa" w:w="1400"/>
+            <w:tcBorders>
+              <w:top w:val="single" w:color="AAAAAA" w:sz="2"/>
+              <w:left w:val="single" w:color="AAAAAA" w:sz="2"/>
+              <w:bottom w:val="single" w:color="AAAAAA" w:sz="2"/>
+              <w:right w:val="single" w:color="AAAAAA" w:sz="2"/>
+            </w:tcBorders>
+            <w:tcMar>
+              <w:top w:type="dxa" w:w="70"/>
+              <w:left w:type="dxa" w:w="90"/>
+              <w:bottom w:type="dxa" w:w="70"/>
+              <w:right w:type="dxa" w:w="90"/>
+            </w:tcMar>
+            <w:vAlign w:val="center"/>
+          </w:tcPr>
+          <w:p>
+            <w:r/>
+          </w:p>
+        </w:tc>
+        <w:tc>
+          <w:tcPr>
+            <w:tcW w:type="dxa" w:w="5760"/>
+            <w:tcBorders>
+              <w:top w:val="single" w:color="AAAAAA" w:sz="2"/>
+              <w:left w:val="single" w:color="AAAAAA" w:sz="2"/>
+              <w:bottom w:val="single" w:color="AAAAAA" w:sz="2"/>
+              <w:right w:val="single" w:color="AAAAAA" w:sz="2"/>
+            </w:tcBorders>
+            <w:tcMar>
+              <w:top w:type="dxa" w:w="70"/>
+              <w:left w:type="dxa" w:w="90"/>
+              <w:bottom w:type="dxa" w:w="70"/>
+              <w:right w:type="dxa" w:w="90"/>
+            </w:tcMar>
+            <w:vAlign w:val="center"/>
+          </w:tcPr>
+          <w:p>
+            <w:r/>
+          </w:p>
+        </w:tc>
+      </w:tr>
+      <w:tr>
+        <w:tc>
+          <w:tcPr>
+            <w:tcW w:type="dxa" w:w="2200"/>
+            <w:tcBorders>
+              <w:top w:val="single" w:color="AAAAAA" w:sz="2"/>
+              <w:left w:val="single" w:color="AAAAAA" w:sz="2"/>
+              <w:bottom w:val="single" w:color="AAAAAA" w:sz="2"/>
+              <w:right w:val="single" w:color="AAAAAA" w:sz="2"/>
+            </w:tcBorders>
+            <w:tcMar>
+              <w:top w:type="dxa" w:w="70"/>
+              <w:left w:type="dxa" w:w="90"/>
+              <w:bottom w:type="dxa" w:w="70"/>
+              <w:right w:type="dxa" w:w="90"/>
+            </w:tcMar>
+            <w:vAlign w:val="center"/>
+          </w:tcPr>
+          <w:p>
+            <w:r>
+              <w:t>country</w:t>
+            </w:r>
+          </w:p>
+        </w:tc>
+        <w:tc>
+          <w:tcPr>
+            <w:tcW w:type="dxa" w:w="1400"/>
+            <w:tcBorders>
+              <w:top w:val="single" w:color="AAAAAA" w:sz="2"/>
+              <w:left w:val="single" w:color="AAAAAA" w:sz="2"/>
+              <w:bottom w:val="single" w:color="AAAAAA" w:sz="2"/>
+              <w:right w:val="single" w:color="AAAAAA" w:sz="2"/>
+            </w:tcBorders>
+            <w:tcMar>
+              <w:top w:type="dxa" w:w="70"/>
+              <w:left w:type="dxa" w:w="90"/>
+              <w:bottom w:type="dxa" w:w="70"/>
+              <w:right w:type="dxa" w:w="90"/>
+            </w:tcMar>
+            <w:vAlign w:val="center"/>
+          </w:tcPr>
+          <w:p>
+            <w:r/>
+          </w:p>
+        </w:tc>
+        <w:tc>
+          <w:tcPr>
+            <w:tcW w:type="dxa" w:w="5760"/>
+            <w:tcBorders>
+              <w:top w:val="single" w:color="AAAAAA" w:sz="2"/>
+              <w:left w:val="single" w:color="AAAAAA" w:sz="2"/>
+              <w:bottom w:val="single" w:color="AAAAAA" w:sz="2"/>
+              <w:right w:val="single" w:color="AAAAAA" w:sz="2"/>
+            </w:tcBorders>
+            <w:tcMar>
+              <w:top w:type="dxa" w:w="70"/>
+              <w:left w:type="dxa" w:w="90"/>
+              <w:bottom w:type="dxa" w:w="70"/>
+              <w:right w:type="dxa" w:w="90"/>
+            </w:tcMar>
+            <w:vAlign w:val="center"/>
+          </w:tcPr>
+          <w:p>
+            <w:r/>
+          </w:p>
+        </w:tc>
+      </w:tr>
     </w:tbl>
     <w:p>
       <w:pPr>
@@ -21667,6 +22123,274 @@
           </w:p>
         </w:tc>
       </w:tr>
+      <w:tr>
+        <w:tc>
+          <w:tcPr>
+            <w:tcW w:type="dxa" w:w="2200"/>
+            <w:tcBorders>
+              <w:top w:val="single" w:color="AAAAAA" w:sz="2"/>
+              <w:left w:val="single" w:color="AAAAAA" w:sz="2"/>
+              <w:bottom w:val="single" w:color="AAAAAA" w:sz="2"/>
+              <w:right w:val="single" w:color="AAAAAA" w:sz="2"/>
+            </w:tcBorders>
+            <w:tcMar>
+              <w:top w:type="dxa" w:w="70"/>
+              <w:left w:type="dxa" w:w="90"/>
+              <w:bottom w:type="dxa" w:w="70"/>
+              <w:right w:type="dxa" w:w="90"/>
+            </w:tcMar>
+            <w:vAlign w:val="center"/>
+          </w:tcPr>
+          <w:p>
+            <w:r>
+              <w:t>yearLevel</w:t>
+            </w:r>
+          </w:p>
+        </w:tc>
+        <w:tc>
+          <w:tcPr>
+            <w:tcW w:type="dxa" w:w="1400"/>
+            <w:tcBorders>
+              <w:top w:val="single" w:color="AAAAAA" w:sz="2"/>
+              <w:left w:val="single" w:color="AAAAAA" w:sz="2"/>
+              <w:bottom w:val="single" w:color="AAAAAA" w:sz="2"/>
+              <w:right w:val="single" w:color="AAAAAA" w:sz="2"/>
+            </w:tcBorders>
+            <w:tcMar>
+              <w:top w:type="dxa" w:w="70"/>
+              <w:left w:type="dxa" w:w="90"/>
+              <w:bottom w:type="dxa" w:w="70"/>
+              <w:right w:type="dxa" w:w="90"/>
+            </w:tcMar>
+            <w:vAlign w:val="center"/>
+          </w:tcPr>
+          <w:p>
+            <w:r/>
+          </w:p>
+        </w:tc>
+        <w:tc>
+          <w:tcPr>
+            <w:tcW w:type="dxa" w:w="5760"/>
+            <w:tcBorders>
+              <w:top w:val="single" w:color="AAAAAA" w:sz="2"/>
+              <w:left w:val="single" w:color="AAAAAA" w:sz="2"/>
+              <w:bottom w:val="single" w:color="AAAAAA" w:sz="2"/>
+              <w:right w:val="single" w:color="AAAAAA" w:sz="2"/>
+            </w:tcBorders>
+            <w:tcMar>
+              <w:top w:type="dxa" w:w="70"/>
+              <w:left w:type="dxa" w:w="90"/>
+              <w:bottom w:type="dxa" w:w="70"/>
+              <w:right w:type="dxa" w:w="90"/>
+            </w:tcMar>
+            <w:vAlign w:val="center"/>
+          </w:tcPr>
+          <w:p>
+            <w:r/>
+          </w:p>
+        </w:tc>
+      </w:tr>
+      <w:tr>
+        <w:tc>
+          <w:tcPr>
+            <w:tcW w:type="dxa" w:w="2200"/>
+            <w:tcBorders>
+              <w:top w:val="single" w:color="AAAAAA" w:sz="2"/>
+              <w:left w:val="single" w:color="AAAAAA" w:sz="2"/>
+              <w:bottom w:val="single" w:color="AAAAAA" w:sz="2"/>
+              <w:right w:val="single" w:color="AAAAAA" w:sz="2"/>
+            </w:tcBorders>
+            <w:tcMar>
+              <w:top w:type="dxa" w:w="70"/>
+              <w:left w:type="dxa" w:w="90"/>
+              <w:bottom w:type="dxa" w:w="70"/>
+              <w:right w:type="dxa" w:w="90"/>
+            </w:tcMar>
+            <w:vAlign w:val="center"/>
+          </w:tcPr>
+          <w:p>
+            <w:r>
+              <w:t>enrollmentType</w:t>
+            </w:r>
+          </w:p>
+        </w:tc>
+        <w:tc>
+          <w:tcPr>
+            <w:tcW w:type="dxa" w:w="1400"/>
+            <w:tcBorders>
+              <w:top w:val="single" w:color="AAAAAA" w:sz="2"/>
+              <w:left w:val="single" w:color="AAAAAA" w:sz="2"/>
+              <w:bottom w:val="single" w:color="AAAAAA" w:sz="2"/>
+              <w:right w:val="single" w:color="AAAAAA" w:sz="2"/>
+            </w:tcBorders>
+            <w:tcMar>
+              <w:top w:type="dxa" w:w="70"/>
+              <w:left w:type="dxa" w:w="90"/>
+              <w:bottom w:type="dxa" w:w="70"/>
+              <w:right w:type="dxa" w:w="90"/>
+            </w:tcMar>
+            <w:vAlign w:val="center"/>
+          </w:tcPr>
+          <w:p>
+            <w:r/>
+          </w:p>
+        </w:tc>
+        <w:tc>
+          <w:tcPr>
+            <w:tcW w:type="dxa" w:w="5760"/>
+            <w:tcBorders>
+              <w:top w:val="single" w:color="AAAAAA" w:sz="2"/>
+              <w:left w:val="single" w:color="AAAAAA" w:sz="2"/>
+              <w:bottom w:val="single" w:color="AAAAAA" w:sz="2"/>
+              <w:right w:val="single" w:color="AAAAAA" w:sz="2"/>
+            </w:tcBorders>
+            <w:tcMar>
+              <w:top w:type="dxa" w:w="70"/>
+              <w:left w:type="dxa" w:w="90"/>
+              <w:bottom w:type="dxa" w:w="70"/>
+              <w:right w:type="dxa" w:w="90"/>
+            </w:tcMar>
+            <w:vAlign w:val="center"/>
+          </w:tcPr>
+          <w:p>
+            <w:r/>
+          </w:p>
+        </w:tc>
+      </w:tr>
+      <w:tr>
+        <w:tc>
+          <w:tcPr>
+            <w:tcW w:type="dxa" w:w="2200"/>
+            <w:tcBorders>
+              <w:top w:val="single" w:color="AAAAAA" w:sz="2"/>
+              <w:left w:val="single" w:color="AAAAAA" w:sz="2"/>
+              <w:bottom w:val="single" w:color="AAAAAA" w:sz="2"/>
+              <w:right w:val="single" w:color="AAAAAA" w:sz="2"/>
+            </w:tcBorders>
+            <w:tcMar>
+              <w:top w:type="dxa" w:w="70"/>
+              <w:left w:type="dxa" w:w="90"/>
+              <w:bottom w:type="dxa" w:w="70"/>
+              <w:right w:type="dxa" w:w="90"/>
+            </w:tcMar>
+            <w:vAlign w:val="center"/>
+          </w:tcPr>
+          <w:p>
+            <w:r>
+              <w:t>formIssuedDate</w:t>
+            </w:r>
+          </w:p>
+        </w:tc>
+        <w:tc>
+          <w:tcPr>
+            <w:tcW w:type="dxa" w:w="1400"/>
+            <w:tcBorders>
+              <w:top w:val="single" w:color="AAAAAA" w:sz="2"/>
+              <w:left w:val="single" w:color="AAAAAA" w:sz="2"/>
+              <w:bottom w:val="single" w:color="AAAAAA" w:sz="2"/>
+              <w:right w:val="single" w:color="AAAAAA" w:sz="2"/>
+            </w:tcBorders>
+            <w:tcMar>
+              <w:top w:type="dxa" w:w="70"/>
+              <w:left w:type="dxa" w:w="90"/>
+              <w:bottom w:type="dxa" w:w="70"/>
+              <w:right w:type="dxa" w:w="90"/>
+            </w:tcMar>
+            <w:vAlign w:val="center"/>
+          </w:tcPr>
+          <w:p>
+            <w:r/>
+          </w:p>
+        </w:tc>
+        <w:tc>
+          <w:tcPr>
+            <w:tcW w:type="dxa" w:w="5760"/>
+            <w:tcBorders>
+              <w:top w:val="single" w:color="AAAAAA" w:sz="2"/>
+              <w:left w:val="single" w:color="AAAAAA" w:sz="2"/>
+              <w:bottom w:val="single" w:color="AAAAAA" w:sz="2"/>
+              <w:right w:val="single" w:color="AAAAAA" w:sz="2"/>
+            </w:tcBorders>
+            <w:tcMar>
+              <w:top w:type="dxa" w:w="70"/>
+              <w:left w:type="dxa" w:w="90"/>
+              <w:bottom w:type="dxa" w:w="70"/>
+              <w:right w:type="dxa" w:w="90"/>
+            </w:tcMar>
+            <w:vAlign w:val="center"/>
+          </w:tcPr>
+          <w:p>
+            <w:r/>
+          </w:p>
+        </w:tc>
+      </w:tr>
+      <w:tr>
+        <w:tc>
+          <w:tcPr>
+            <w:tcW w:type="dxa" w:w="2200"/>
+            <w:tcBorders>
+              <w:top w:val="single" w:color="AAAAAA" w:sz="2"/>
+              <w:left w:val="single" w:color="AAAAAA" w:sz="2"/>
+              <w:bottom w:val="single" w:color="AAAAAA" w:sz="2"/>
+              <w:right w:val="single" w:color="AAAAAA" w:sz="2"/>
+            </w:tcBorders>
+            <w:tcMar>
+              <w:top w:type="dxa" w:w="70"/>
+              <w:left w:type="dxa" w:w="90"/>
+              <w:bottom w:type="dxa" w:w="70"/>
+              <w:right w:type="dxa" w:w="90"/>
+            </w:tcMar>
+            <w:vAlign w:val="center"/>
+          </w:tcPr>
+          <w:p>
+            <w:r>
+              <w:t>formSignedDate</w:t>
+            </w:r>
+          </w:p>
+        </w:tc>
+        <w:tc>
+          <w:tcPr>
+            <w:tcW w:type="dxa" w:w="1400"/>
+            <w:tcBorders>
+              <w:top w:val="single" w:color="AAAAAA" w:sz="2"/>
+              <w:left w:val="single" w:color="AAAAAA" w:sz="2"/>
+              <w:bottom w:val="single" w:color="AAAAAA" w:sz="2"/>
+              <w:right w:val="single" w:color="AAAAAA" w:sz="2"/>
+            </w:tcBorders>
+            <w:tcMar>
+              <w:top w:type="dxa" w:w="70"/>
+              <w:left w:type="dxa" w:w="90"/>
+              <w:bottom w:type="dxa" w:w="70"/>
+              <w:right w:type="dxa" w:w="90"/>
+            </w:tcMar>
+            <w:vAlign w:val="center"/>
+          </w:tcPr>
+          <w:p>
+            <w:r/>
+          </w:p>
+        </w:tc>
+        <w:tc>
+          <w:tcPr>
+            <w:tcW w:type="dxa" w:w="5760"/>
+            <w:tcBorders>
+              <w:top w:val="single" w:color="AAAAAA" w:sz="2"/>
+              <w:left w:val="single" w:color="AAAAAA" w:sz="2"/>
+              <w:bottom w:val="single" w:color="AAAAAA" w:sz="2"/>
+              <w:right w:val="single" w:color="AAAAAA" w:sz="2"/>
+            </w:tcBorders>
+            <w:tcMar>
+              <w:top w:type="dxa" w:w="70"/>
+              <w:left w:type="dxa" w:w="90"/>
+              <w:bottom w:type="dxa" w:w="70"/>
+              <w:right w:type="dxa" w:w="90"/>
+            </w:tcMar>
+            <w:vAlign w:val="center"/>
+          </w:tcPr>
+          <w:p>
+            <w:r/>
+          </w:p>
+        </w:tc>
+      </w:tr>
     </w:tbl>
     <w:p>
       <w:pPr>
@@ -30008,6 +30732,144 @@
               </w:rPr>
               <w:t xml:space="preserve"/>
             </w:r>
+          </w:p>
+        </w:tc>
+      </w:tr>
+      <w:tr>
+        <w:tc>
+          <w:tcPr>
+            <w:tcW w:type="dxa" w:w="2200"/>
+            <w:tcBorders>
+              <w:top w:val="single" w:color="AAAAAA" w:sz="2"/>
+              <w:left w:val="single" w:color="AAAAAA" w:sz="2"/>
+              <w:bottom w:val="single" w:color="AAAAAA" w:sz="2"/>
+              <w:right w:val="single" w:color="AAAAAA" w:sz="2"/>
+            </w:tcBorders>
+            <w:tcMar>
+              <w:top w:type="dxa" w:w="70"/>
+              <w:left w:type="dxa" w:w="90"/>
+              <w:bottom w:type="dxa" w:w="70"/>
+              <w:right w:type="dxa" w:w="90"/>
+            </w:tcMar>
+            <w:vAlign w:val="center"/>
+          </w:tcPr>
+          <w:p>
+            <w:r>
+              <w:t>receivedBy</w:t>
+            </w:r>
+          </w:p>
+        </w:tc>
+        <w:tc>
+          <w:tcPr>
+            <w:tcW w:type="dxa" w:w="1400"/>
+            <w:tcBorders>
+              <w:top w:val="single" w:color="AAAAAA" w:sz="2"/>
+              <w:left w:val="single" w:color="AAAAAA" w:sz="2"/>
+              <w:bottom w:val="single" w:color="AAAAAA" w:sz="2"/>
+              <w:right w:val="single" w:color="AAAAAA" w:sz="2"/>
+            </w:tcBorders>
+            <w:tcMar>
+              <w:top w:type="dxa" w:w="70"/>
+              <w:left w:type="dxa" w:w="90"/>
+              <w:bottom w:type="dxa" w:w="70"/>
+              <w:right w:type="dxa" w:w="90"/>
+            </w:tcMar>
+            <w:vAlign w:val="center"/>
+          </w:tcPr>
+          <w:p>
+            <w:r>
+              <w:t>FK</w:t>
+            </w:r>
+          </w:p>
+        </w:tc>
+        <w:tc>
+          <w:tcPr>
+            <w:tcW w:type="dxa" w:w="5760"/>
+            <w:tcBorders>
+              <w:top w:val="single" w:color="AAAAAA" w:sz="2"/>
+              <w:left w:val="single" w:color="AAAAAA" w:sz="2"/>
+              <w:bottom w:val="single" w:color="AAAAAA" w:sz="2"/>
+              <w:right w:val="single" w:color="AAAAAA" w:sz="2"/>
+            </w:tcBorders>
+            <w:tcMar>
+              <w:top w:type="dxa" w:w="70"/>
+              <w:left w:type="dxa" w:w="90"/>
+              <w:bottom w:type="dxa" w:w="70"/>
+              <w:right w:type="dxa" w:w="90"/>
+            </w:tcMar>
+            <w:vAlign w:val="center"/>
+          </w:tcPr>
+          <w:p>
+            <w:r>
+              <w:t>→ StaffUsers.1:M, nullable — empty until the Registrar in-charge receives the completed slip</w:t>
+            </w:r>
+          </w:p>
+        </w:tc>
+      </w:tr>
+      <w:tr>
+        <w:tc>
+          <w:tcPr>
+            <w:tcW w:type="dxa" w:w="2200"/>
+            <w:tcBorders>
+              <w:top w:val="single" w:color="AAAAAA" w:sz="2"/>
+              <w:left w:val="single" w:color="AAAAAA" w:sz="2"/>
+              <w:bottom w:val="single" w:color="AAAAAA" w:sz="2"/>
+              <w:right w:val="single" w:color="AAAAAA" w:sz="2"/>
+            </w:tcBorders>
+            <w:tcMar>
+              <w:top w:type="dxa" w:w="70"/>
+              <w:left w:type="dxa" w:w="90"/>
+              <w:bottom w:type="dxa" w:w="70"/>
+              <w:right w:type="dxa" w:w="90"/>
+            </w:tcMar>
+            <w:vAlign w:val="center"/>
+          </w:tcPr>
+          <w:p>
+            <w:r>
+              <w:t>receivedDate</w:t>
+            </w:r>
+          </w:p>
+        </w:tc>
+        <w:tc>
+          <w:tcPr>
+            <w:tcW w:type="dxa" w:w="1400"/>
+            <w:tcBorders>
+              <w:top w:val="single" w:color="AAAAAA" w:sz="2"/>
+              <w:left w:val="single" w:color="AAAAAA" w:sz="2"/>
+              <w:bottom w:val="single" w:color="AAAAAA" w:sz="2"/>
+              <w:right w:val="single" w:color="AAAAAA" w:sz="2"/>
+            </w:tcBorders>
+            <w:tcMar>
+              <w:top w:type="dxa" w:w="70"/>
+              <w:left w:type="dxa" w:w="90"/>
+              <w:bottom w:type="dxa" w:w="70"/>
+              <w:right w:type="dxa" w:w="90"/>
+            </w:tcMar>
+            <w:vAlign w:val="center"/>
+          </w:tcPr>
+          <w:p>
+            <w:r/>
+          </w:p>
+        </w:tc>
+        <w:tc>
+          <w:tcPr>
+            <w:tcW w:type="dxa" w:w="5760"/>
+            <w:tcBorders>
+              <w:top w:val="single" w:color="AAAAAA" w:sz="2"/>
+              <w:left w:val="single" w:color="AAAAAA" w:sz="2"/>
+              <w:bottom w:val="single" w:color="AAAAAA" w:sz="2"/>
+              <w:right w:val="single" w:color="AAAAAA" w:sz="2"/>
+            </w:tcBorders>
+            <w:tcMar>
+              <w:top w:type="dxa" w:w="70"/>
+              <w:left w:type="dxa" w:w="90"/>
+              <w:bottom w:type="dxa" w:w="70"/>
+              <w:right w:type="dxa" w:w="90"/>
+            </w:tcMar>
+            <w:vAlign w:val="center"/>
+          </w:tcPr>
+          <w:p>
+            <w:r/>
           </w:p>
         </w:tc>
       </w:tr>

</xml_diff>

<commit_message>
Execute Build Plan Stage 1 database finalization: online modes dropped, status enum extended, 8 new RBAC/audit/admin tables, seeds, docs synced to 54 tables / 86 FKs
</commit_message>
<xml_diff>
--- a/Documentation/EMS Complete Documentation.docx
+++ b/Documentation/EMS Complete Documentation.docx
@@ -60,7 +60,7 @@
           <w:sz w:val="20"/>
           <w:szCs w:val="20"/>
         </w:rPr>
-        <w:t>46 tables, 79 foreign-key constraints — validated schema</w:t>
+        <w:t>54 tables, 86 foreign-key constraints — validated schema</w:t>
       </w:r>
     </w:p>
     <w:p>
@@ -5095,7 +5095,7 @@
         <w:spacing w:after="190" w:before="380"/>
       </w:pPr>
       <w:r>
-        <w:t>3. Complete Data Dictionary (46 tables)</w:t>
+        <w:t>3. Complete Data Dictionary (54 tables)</w:t>
       </w:r>
     </w:p>
     <w:p>
@@ -22404,7 +22404,7 @@
           <w:sz w:val="16"/>
           <w:szCs w:val="16"/>
         </w:rPr>
-        <w:t xml:space="preserve">Referenced by: EnrolledSubjects.enrollmentId (1:M); CreditedSubjects.enrollmentId (1:M); StudentAssessments.enrollmentId (1:M); Payments.enrollmentId (1:M); IdRequests.enrollmentId (1:M); DocumentPrintLog.enrollmentId (1:M); EnrollmentWorkflow.enrollmentId (1:1)</w:t>
+        <w:t>Referenced by: EnrolledSubjects.enrollmentId (1:M); CreditedSubjects.enrollmentId (1:M); StudentAssessments.enrollmentId (1:M); Payments.enrollmentId (1:M); IdRequests.enrollmentId (1:M); DocumentPrintLog.enrollmentId (1:M); EnrollmentWorkflow.enrollmentId (1:1); EnrollmentStatusHistory.enrollmentId (1:M)</w:t>
       </w:r>
     </w:p>
     <w:p>
@@ -22417,6 +22417,31 @@
           <w:szCs w:val="2"/>
         </w:rPr>
         <w:t xml:space="preserve"/>
+      </w:r>
+    </w:p>
+    <w:p>
+      <w:pPr>
+        <w:pStyle w:val="Heading3"/>
+        <w:spacing w:after="100" w:before="200"/>
+      </w:pPr>
+      <w:r>
+        <w:t xml:space="preserve">EnrollmentStatusHistory</w:t>
+      </w:r>
+    </w:p>
+    <w:p>
+      <w:pPr>
+        <w:spacing w:after="140"/>
+      </w:pPr>
+      <w:r>
+        <w:t xml:space="preserve">One row per transition of an enrollment through the state machine (pending, evaluated, assessed, paid, enrolled, dropped) — who changed it, from/to what, and when. Role in workflow: the audit spine for BR12-BR14/BR16 enforcement in Stage 2.</w:t>
+      </w:r>
+    </w:p>
+    <w:p>
+      <w:pPr>
+        <w:spacing w:after="140"/>
+      </w:pPr>
+      <w:r>
+        <w:t xml:space="preserve">Referenced by: (none — it references others)</w:t>
       </w:r>
     </w:p>
     <w:p>
@@ -38169,7 +38194,125 @@
           <w:sz w:val="16"/>
           <w:szCs w:val="16"/>
         </w:rPr>
-        <w:t xml:space="preserve">Referenced by: Documents.verifiedBy (1:M, optional); Admissions.evaluatedBy (1:M); Enrollments.evaluatedBy (1:M); Enrollments.registrarProcessedBy (1:M); StudentScholarships.approvedBy (1:M); Payments.processedBy (1:M, optional); ClearanceApprovals.approvedBy (1:M, optional); Schedules.instructorId (1:M); StudentIds.validatedBy (1:M, optional); DocumentPrintLog.printedBy (1:M); WorkflowSteps.signedBy (1:M, optional)</w:t>
+        <w:t>Referenced by: Documents.verifiedBy (1:M, optional); Admissions.evaluatedBy (1:M); Enrollments.evaluatedBy (1:M); Enrollments.registrarProcessedBy (1:M); StudentScholarships.approvedBy (1:M); Payments.processedBy (1:M, optional); ClearanceApprovals.approvedBy (1:M, optional); Schedules.instructorId (1:M); StudentIds.validatedBy (1:M, optional); DocumentPrintLog.printedBy (1:M); WorkflowSteps.signedBy (1:M, optional); StaffRoles.userId (1:M); AuditLogs.userId (1:M, optional); EnrollmentStatusHistory.changedBy (1:M, optional)</w:t>
+      </w:r>
+    </w:p>
+    <w:p>
+      <w:pPr>
+        <w:pStyle w:val="Heading3"/>
+        <w:spacing w:after="100" w:before="200"/>
+      </w:pPr>
+      <w:r>
+        <w:t xml:space="preserve">Roles</w:t>
+      </w:r>
+    </w:p>
+    <w:p>
+      <w:pPr>
+        <w:spacing w:after="140"/>
+      </w:pPr>
+      <w:r>
+        <w:t xml:space="preserve">One row per role in the system (AdmissionOfficer, GuidanceStaff, DeptEvaluator, Dean, AccountingStaff, ScholarshipOfficer, RegistrarDesk, RegistrarApprover, BlockingCoordinator, ClinicStaff, IdOfficer, SysAdmin, Staff). Role in workflow: the RBAC spine that replaces the single staffusers.role enum; a staff member can hold multiple roles.</w:t>
+      </w:r>
+    </w:p>
+    <w:p>
+      <w:pPr>
+        <w:spacing w:after="140"/>
+      </w:pPr>
+      <w:r>
+        <w:t xml:space="preserve">Referenced by: RolePermissions.roleId (1:M); StaffRoles.roleId (1:M)</w:t>
+      </w:r>
+    </w:p>
+    <w:p>
+      <w:pPr>
+        <w:pStyle w:val="Heading3"/>
+        <w:spacing w:after="100" w:before="200"/>
+      </w:pPr>
+      <w:r>
+        <w:t xml:space="preserve">Permissions</w:t>
+      </w:r>
+    </w:p>
+    <w:p>
+      <w:pPr>
+        <w:spacing w:after="140"/>
+      </w:pPr>
+      <w:r>
+        <w:t xml:space="preserve">One row per permission (module-named, e.g. clearance.receive, print.certificate). Role in workflow: what a role is allowed to do; SysAdmin holds all 13.</w:t>
+      </w:r>
+    </w:p>
+    <w:p>
+      <w:pPr>
+        <w:spacing w:after="140"/>
+      </w:pPr>
+      <w:r>
+        <w:t xml:space="preserve">Referenced by: RolePermissions.permissionId (1:M)</w:t>
+      </w:r>
+    </w:p>
+    <w:p>
+      <w:pPr>
+        <w:pStyle w:val="Heading3"/>
+        <w:spacing w:after="100" w:before="200"/>
+      </w:pPr>
+      <w:r>
+        <w:t xml:space="preserve">RolePermissions</w:t>
+      </w:r>
+    </w:p>
+    <w:p>
+      <w:pPr>
+        <w:spacing w:after="140"/>
+      </w:pPr>
+      <w:r>
+        <w:t xml:space="preserve">Junction table linking roles to permissions (M:N).</w:t>
+      </w:r>
+    </w:p>
+    <w:p>
+      <w:pPr>
+        <w:pStyle w:val="Heading3"/>
+        <w:spacing w:after="100" w:before="200"/>
+      </w:pPr>
+      <w:r>
+        <w:t xml:space="preserve">StaffRoles</w:t>
+      </w:r>
+    </w:p>
+    <w:p>
+      <w:pPr>
+        <w:spacing w:after="140"/>
+      </w:pPr>
+      <w:r>
+        <w:t xml:space="preserve">Junction table linking staff users to roles (M:N) — the many-roles-per-staff replacement for the old single role enum.</w:t>
+      </w:r>
+    </w:p>
+    <w:p>
+      <w:pPr>
+        <w:pStyle w:val="Heading3"/>
+        <w:spacing w:after="100" w:before="200"/>
+      </w:pPr>
+      <w:r>
+        <w:t xml:space="preserve">AuditLogs</w:t>
+      </w:r>
+    </w:p>
+    <w:p>
+      <w:pPr>
+        <w:spacing w:after="140"/>
+      </w:pPr>
+      <w:r>
+        <w:t xml:space="preserve">Append-only log of who did what to which record (action, entityTable/entityId, old/new JSON values, IP, timestamp). Role in workflow: auditability for every sensitive operation.</w:t>
+      </w:r>
+    </w:p>
+    <w:p>
+      <w:pPr>
+        <w:pStyle w:val="Heading3"/>
+        <w:spacing w:after="100" w:before="200"/>
+      </w:pPr>
+      <w:r>
+        <w:t xml:space="preserve">Settings</w:t>
+      </w:r>
+    </w:p>
+    <w:p>
+      <w:pPr>
+        <w:spacing w:after="140"/>
+      </w:pPr>
+      <w:r>
+        <w:t xml:space="preserve">Key-value system settings (currentTermId, schoolName, schoolAddress, schoolPhone, clearanceReplacementFee). Role in workflow: single place for school-wide configuration used by print forms and rules.</w:t>
       </w:r>
     </w:p>
     <w:p>
@@ -38203,7 +38346,7 @@
           <w:iCs/>
           <w:color w:val="555555"/>
         </w:rPr>
-        <w:t xml:space="preserve">Optional support for the online channel and document accountability.</w:t>
+        <w:t>Document accountability and in-app notifications.</w:t>
       </w:r>
     </w:p>
     <w:p>
@@ -38212,7 +38355,7 @@
         <w:spacing w:after="100" w:before="200"/>
       </w:pPr>
       <w:r>
-        <w:t>[REMOVED] Notifications</w:t>
+        <w:t>Notifications</w:t>
       </w:r>
     </w:p>
     <w:p>
@@ -38220,7 +38363,7 @@
         <w:spacing w:after="140"/>
       </w:pPr>
       <w:r>
-        <w:t xml:space="preserve">Status-change messages to students. Optional — matters most once online support exists; face-to-face students are told in person.</w:t>
+        <w:t>In-app notifications for students and staff (Laravel-native schema: polymorphic notifiable, JSON payload). Role in workflow: status-change alerts driven by the enrollment state machine (Stage 2).</w:t>
       </w:r>
     </w:p>
     <w:tbl>
@@ -41008,7 +41151,7 @@
         <w:spacing w:after="190" w:before="380"/>
       </w:pPr>
       <w:r>
-        <w:t>4. Why This System Uses 46 tables</w:t>
+        <w:t>4. Why This System Uses 54 tables</w:t>
       </w:r>
     </w:p>
     <w:p>
@@ -41016,7 +41159,7 @@
         <w:spacing w:after="140"/>
       </w:pPr>
       <w:r>
-        <w:t xml:space="preserve">Forty-six is not a target number — it's what's left after applying one rule consistently in both directions: every table represents exactly one distinct real-world thing that needs its own identity and its own history, and no table or column duplicates a value already reachable through a foreign key. The reasoning breaks down into six angles, all pointing at the same structure from different directions.</w:t>
+        <w:t>Fifty-four is not a target number — it's what's left after applying one rule consistently in both directions: every table represents exactly one distinct real-world thing that needs its own identity and its own history, and no table or column duplicates a value already reachable through a foreign key. The reasoning breaks down into six angles, all pointing at the same structure from different directions.</w:t>
       </w:r>
     </w:p>
     <w:p>
@@ -41130,7 +41273,7 @@
           <w:b/>
           <w:bCs/>
         </w:rPr>
-        <w:t>Every one of the 46 tables can be traced to one of these six angles when asked "why does this exist" — and where a table's value depended on a school policy that couldn't be confirmed from the documents provided (fee calculation, standardized religion reporting, reprint-fraud tracking), it was marked optional rather than built in as if it were certain.</w:t>
+        <w:t>Every one of the 54 tables can be traced to one of these six angles when asked "why does this exist" — and where a table's value depended on a school policy that couldn't be confirmed from the documents provided (fee calculation, standardized religion reporting, reprint-fraud tracking), it was marked optional rather than built in as if it were certain.</w:t>
       </w:r>
     </w:p>
     <w:sectPr>

</xml_diff>